<commit_message>
fix: synchronize README model metrics with latest training run and add out-of-sample vs full population policy simulation
</commit_message>
<xml_diff>
--- a/reports/CreditLens_Comprehensive_Model_Report.docx
+++ b/reports/CreditLens_Comprehensive_Model_Report.docx
@@ -143,7 +143,7 @@
                 <w:color w:val="334155"/>
                 <w:sz w:val="19"/>
               </w:rPr>
-              <w:t>Random Forest Classifier (ROC-AUC 0.7781, KS 42.6%)</w:t>
+              <w:t>Random Forest Classifier (ROC-AUC 0.7781, KS 42.57%)</w:t>
             </w:r>
           </w:p>
         </w:tc>
@@ -198,7 +198,7 @@
                 <w:color w:val="334155"/>
                 <w:sz w:val="19"/>
               </w:rPr>
-              <w:t>Logistic Regression - Balanced Weights (ROC-AUC 0.7521, KS 39.3%)</w:t>
+              <w:t>Logistic Regression - Balanced Weights (ROC-AUC 0.7521, KS 39.28%)</w:t>
             </w:r>
           </w:p>
         </w:tc>
@@ -253,7 +253,7 @@
                 <w:color w:val="334155"/>
                 <w:sz w:val="19"/>
               </w:rPr>
-              <w:t>6,000 Out-of-Time / Out-of-Sample Records (20% Stratified Split of 30,000 Accounts)</w:t>
+              <w:t>6,000 Unseen Accounts (20% Stratified Out-of-Sample Test Split)</w:t>
             </w:r>
           </w:p>
         </w:tc>
@@ -282,7 +282,7 @@
                 <w:color w:val="334155"/>
                 <w:sz w:val="19"/>
               </w:rPr>
-              <w:t>Commercial Financial ROI:</w:t>
+              <w:t>Commercial Policy Simulation (Cutoff 620):</w:t>
             </w:r>
           </w:p>
         </w:tc>
@@ -308,7 +308,7 @@
                 <w:color w:val="334155"/>
                 <w:sz w:val="19"/>
               </w:rPr>
-              <w:t>NT$ 128.2M Bad Debt Intercepted  •  NT$ 114.1M Net Capital Preserved</w:t>
+              <w:t>Unseen 6k Test: 65.6% Approved, 11.35% Default Rate, +NT$ 36.0M Net | Full 30k Book: 65.4% Approved, 7.73% Default Rate, +NT$ 206.6M Net</w:t>
             </w:r>
           </w:p>
         </w:tc>
@@ -5798,12 +5798,1403 @@
           <w:color w:val="1E3A8A"/>
           <w:sz w:val="32"/>
         </w:rPr>
-        <w:t>10. Underwriting Policy Trade-Off &amp; Cutoff Schedule</w:t>
+        <w:t>10. Underwriting Policy Trade-Off: Unseen Holdout vs. Full Population</w:t>
       </w:r>
     </w:p>
     <w:p>
       <w:r>
-        <w:t>A critical responsibility for a Credit Risk Analyst or Data Analyst is establishing optimal underwriting cutoffs. The schedule below demonstrates the simulated trade-offs on the 30,000-account benchmark across varying FICO score cutoffs:</w:t>
+        <w:t>A critical responsibility for a Credit Risk Analyst or Data Analyst is establishing optimal underwriting cutoffs. To maintain 100% scientific integrity and avoid in-sample evaluation confusion, CreditLens explicitly provides both the honest out-of-sample holdout validation (data the model never saw during training) and the full population tape simulation:</w:t>
+      </w:r>
+    </w:p>
+    <w:p>
+      <w:pPr>
+        <w:pStyle w:val="Heading2"/>
+      </w:pPr>
+      <w:r>
+        <w:t>10.1 Ground-Truth Out-of-Sample Validation Schedule (6,000 Unseen Accounts)</w:t>
+      </w:r>
+    </w:p>
+    <w:p>
+      <w:r>
+        <w:t>Evaluated strictly on the 20% holdout test partition (N=6,000 accounts, 1,327 actual defaulters) that the model never saw during training:</w:t>
+      </w:r>
+    </w:p>
+    <w:tbl>
+      <w:tblPr>
+        <w:tblW w:type="auto" w:w="0"/>
+        <w:jc w:val="center"/>
+        <w:tblLayout w:type="fixed"/>
+        <w:tblLook w:firstColumn="1" w:firstRow="1" w:lastColumn="0" w:lastRow="0" w:noHBand="0" w:noVBand="1" w:val="04A0"/>
+      </w:tblPr>
+      <w:tblGrid>
+        <w:gridCol w:w="1337"/>
+        <w:gridCol w:w="1337"/>
+        <w:gridCol w:w="1337"/>
+        <w:gridCol w:w="1337"/>
+        <w:gridCol w:w="1337"/>
+        <w:gridCol w:w="1337"/>
+        <w:gridCol w:w="1337"/>
+      </w:tblGrid>
+      <w:tr>
+        <w:tc>
+          <w:tcPr>
+            <w:tcW w:type="dxa" w:w="1584"/>
+            <w:shd w:fill="1E3A8A"/>
+            <w:tcMar>
+              <w:top w:w="140" w:type="dxa"/>
+              <w:bottom w:w="140" w:type="dxa"/>
+              <w:left w:w="140" w:type="dxa"/>
+              <w:right w:w="140" w:type="dxa"/>
+            </w:tcMar>
+            <w:vAlign w:val="center"/>
+          </w:tcPr>
+          <w:p>
+            <w:pPr>
+              <w:spacing w:before="0" w:after="0"/>
+            </w:pPr>
+            <w:r>
+              <w:rPr>
+                <w:rFonts w:ascii="Calibri" w:hAnsi="Calibri"/>
+                <w:b/>
+                <w:color w:val="FFFFFF"/>
+                <w:sz w:val="20"/>
+              </w:rPr>
+              <w:t>Cutoff Score</w:t>
+            </w:r>
+          </w:p>
+        </w:tc>
+        <w:tc>
+          <w:tcPr>
+            <w:tcW w:type="dxa" w:w="1152"/>
+            <w:shd w:fill="1E3A8A"/>
+            <w:tcMar>
+              <w:top w:w="140" w:type="dxa"/>
+              <w:bottom w:w="140" w:type="dxa"/>
+              <w:left w:w="140" w:type="dxa"/>
+              <w:right w:w="140" w:type="dxa"/>
+            </w:tcMar>
+            <w:vAlign w:val="center"/>
+          </w:tcPr>
+          <w:p>
+            <w:pPr>
+              <w:spacing w:before="0" w:after="0"/>
+              <w:jc w:val="right"/>
+            </w:pPr>
+            <w:r>
+              <w:rPr>
+                <w:rFonts w:ascii="Calibri" w:hAnsi="Calibri"/>
+                <w:b/>
+                <w:color w:val="FFFFFF"/>
+                <w:sz w:val="20"/>
+              </w:rPr>
+              <w:t>Approval %</w:t>
+            </w:r>
+          </w:p>
+        </w:tc>
+        <w:tc>
+          <w:tcPr>
+            <w:tcW w:type="dxa" w:w="1296"/>
+            <w:shd w:fill="1E3A8A"/>
+            <w:tcMar>
+              <w:top w:w="140" w:type="dxa"/>
+              <w:bottom w:w="140" w:type="dxa"/>
+              <w:left w:w="140" w:type="dxa"/>
+              <w:right w:w="140" w:type="dxa"/>
+            </w:tcMar>
+            <w:vAlign w:val="center"/>
+          </w:tcPr>
+          <w:p>
+            <w:pPr>
+              <w:spacing w:before="0" w:after="0"/>
+              <w:jc w:val="right"/>
+            </w:pPr>
+            <w:r>
+              <w:rPr>
+                <w:rFonts w:ascii="Calibri" w:hAnsi="Calibri"/>
+                <w:b/>
+                <w:color w:val="FFFFFF"/>
+                <w:sz w:val="20"/>
+              </w:rPr>
+              <w:t>Approved Accts</w:t>
+            </w:r>
+          </w:p>
+        </w:tc>
+        <w:tc>
+          <w:tcPr>
+            <w:tcW w:type="dxa" w:w="1584"/>
+            <w:shd w:fill="1E3A8A"/>
+            <w:tcMar>
+              <w:top w:w="140" w:type="dxa"/>
+              <w:bottom w:w="140" w:type="dxa"/>
+              <w:left w:w="140" w:type="dxa"/>
+              <w:right w:w="140" w:type="dxa"/>
+            </w:tcMar>
+            <w:vAlign w:val="center"/>
+          </w:tcPr>
+          <w:p>
+            <w:pPr>
+              <w:spacing w:before="0" w:after="0"/>
+              <w:jc w:val="right"/>
+            </w:pPr>
+            <w:r>
+              <w:rPr>
+                <w:rFonts w:ascii="Calibri" w:hAnsi="Calibri"/>
+                <w:b/>
+                <w:color w:val="FFFFFF"/>
+                <w:sz w:val="20"/>
+              </w:rPr>
+              <w:t>Approved Default %</w:t>
+            </w:r>
+          </w:p>
+        </w:tc>
+        <w:tc>
+          <w:tcPr>
+            <w:tcW w:type="dxa" w:w="1440"/>
+            <w:shd w:fill="1E3A8A"/>
+            <w:tcMar>
+              <w:top w:w="140" w:type="dxa"/>
+              <w:bottom w:w="140" w:type="dxa"/>
+              <w:left w:w="140" w:type="dxa"/>
+              <w:right w:w="140" w:type="dxa"/>
+            </w:tcMar>
+            <w:vAlign w:val="center"/>
+          </w:tcPr>
+          <w:p>
+            <w:pPr>
+              <w:spacing w:before="0" w:after="0"/>
+              <w:jc w:val="right"/>
+            </w:pPr>
+            <w:r>
+              <w:rPr>
+                <w:rFonts w:ascii="Calibri" w:hAnsi="Calibri"/>
+                <w:b/>
+                <w:color w:val="FFFFFF"/>
+                <w:sz w:val="20"/>
+              </w:rPr>
+              <w:t>Bad Debt Avoided</w:t>
+            </w:r>
+          </w:p>
+        </w:tc>
+        <w:tc>
+          <w:tcPr>
+            <w:tcW w:type="dxa" w:w="1440"/>
+            <w:shd w:fill="1E3A8A"/>
+            <w:tcMar>
+              <w:top w:w="140" w:type="dxa"/>
+              <w:bottom w:w="140" w:type="dxa"/>
+              <w:left w:w="140" w:type="dxa"/>
+              <w:right w:w="140" w:type="dxa"/>
+            </w:tcMar>
+            <w:vAlign w:val="center"/>
+          </w:tcPr>
+          <w:p>
+            <w:pPr>
+              <w:spacing w:before="0" w:after="0"/>
+              <w:jc w:val="right"/>
+            </w:pPr>
+            <w:r>
+              <w:rPr>
+                <w:rFonts w:ascii="Calibri" w:hAnsi="Calibri"/>
+                <w:b/>
+                <w:color w:val="FFFFFF"/>
+                <w:sz w:val="20"/>
+              </w:rPr>
+              <w:t>Lost APR Interest</w:t>
+            </w:r>
+          </w:p>
+        </w:tc>
+        <w:tc>
+          <w:tcPr>
+            <w:tcW w:type="dxa" w:w="1584"/>
+            <w:shd w:fill="1E3A8A"/>
+            <w:tcMar>
+              <w:top w:w="140" w:type="dxa"/>
+              <w:bottom w:w="140" w:type="dxa"/>
+              <w:left w:w="140" w:type="dxa"/>
+              <w:right w:w="140" w:type="dxa"/>
+            </w:tcMar>
+            <w:vAlign w:val="center"/>
+          </w:tcPr>
+          <w:p>
+            <w:pPr>
+              <w:spacing w:before="0" w:after="0"/>
+              <w:jc w:val="right"/>
+            </w:pPr>
+            <w:r>
+              <w:rPr>
+                <w:rFonts w:ascii="Calibri" w:hAnsi="Calibri"/>
+                <w:b/>
+                <w:color w:val="FFFFFF"/>
+                <w:sz w:val="20"/>
+              </w:rPr>
+              <w:t>Net Financial Benefit</w:t>
+            </w:r>
+          </w:p>
+        </w:tc>
+      </w:tr>
+      <w:tr>
+        <w:tc>
+          <w:tcPr>
+            <w:tcW w:type="dxa" w:w="1584"/>
+            <w:shd w:fill="FFFFFF"/>
+            <w:tcMar>
+              <w:top w:w="100" w:type="dxa"/>
+              <w:bottom w:w="100" w:type="dxa"/>
+              <w:left w:w="140" w:type="dxa"/>
+              <w:right w:w="140" w:type="dxa"/>
+            </w:tcMar>
+            <w:vAlign w:val="center"/>
+          </w:tcPr>
+          <w:p>
+            <w:pPr>
+              <w:spacing w:before="0" w:after="0"/>
+            </w:pPr>
+            <w:r>
+              <w:rPr>
+                <w:rFonts w:ascii="Calibri" w:hAnsi="Calibri"/>
+                <w:b/>
+                <w:color w:val="334155"/>
+                <w:sz w:val="19"/>
+              </w:rPr>
+              <w:t>FICO 500</w:t>
+            </w:r>
+          </w:p>
+        </w:tc>
+        <w:tc>
+          <w:tcPr>
+            <w:tcW w:type="dxa" w:w="1152"/>
+            <w:shd w:fill="FFFFFF"/>
+            <w:tcMar>
+              <w:top w:w="100" w:type="dxa"/>
+              <w:bottom w:w="100" w:type="dxa"/>
+              <w:left w:w="140" w:type="dxa"/>
+              <w:right w:w="140" w:type="dxa"/>
+            </w:tcMar>
+            <w:vAlign w:val="center"/>
+          </w:tcPr>
+          <w:p>
+            <w:pPr>
+              <w:spacing w:before="0" w:after="0"/>
+              <w:jc w:val="right"/>
+            </w:pPr>
+            <w:r>
+              <w:rPr>
+                <w:rFonts w:ascii="Calibri" w:hAnsi="Calibri"/>
+                <w:color w:val="334155"/>
+                <w:sz w:val="19"/>
+              </w:rPr>
+              <w:t>98.1%</w:t>
+            </w:r>
+          </w:p>
+        </w:tc>
+        <w:tc>
+          <w:tcPr>
+            <w:tcW w:type="dxa" w:w="1296"/>
+            <w:shd w:fill="FFFFFF"/>
+            <w:tcMar>
+              <w:top w:w="100" w:type="dxa"/>
+              <w:bottom w:w="100" w:type="dxa"/>
+              <w:left w:w="140" w:type="dxa"/>
+              <w:right w:w="140" w:type="dxa"/>
+            </w:tcMar>
+            <w:vAlign w:val="center"/>
+          </w:tcPr>
+          <w:p>
+            <w:pPr>
+              <w:spacing w:before="0" w:after="0"/>
+              <w:jc w:val="right"/>
+            </w:pPr>
+            <w:r>
+              <w:rPr>
+                <w:rFonts w:ascii="Calibri" w:hAnsi="Calibri"/>
+                <w:color w:val="334155"/>
+                <w:sz w:val="19"/>
+              </w:rPr>
+              <w:t>5,886</w:t>
+            </w:r>
+          </w:p>
+        </w:tc>
+        <w:tc>
+          <w:tcPr>
+            <w:tcW w:type="dxa" w:w="1584"/>
+            <w:shd w:fill="FFFFFF"/>
+            <w:tcMar>
+              <w:top w:w="100" w:type="dxa"/>
+              <w:bottom w:w="100" w:type="dxa"/>
+              <w:left w:w="140" w:type="dxa"/>
+              <w:right w:w="140" w:type="dxa"/>
+            </w:tcMar>
+            <w:vAlign w:val="center"/>
+          </w:tcPr>
+          <w:p>
+            <w:pPr>
+              <w:spacing w:before="0" w:after="0"/>
+              <w:jc w:val="right"/>
+            </w:pPr>
+            <w:r>
+              <w:rPr>
+                <w:rFonts w:ascii="Calibri" w:hAnsi="Calibri"/>
+                <w:color w:val="334155"/>
+                <w:sz w:val="19"/>
+              </w:rPr>
+              <w:t>21.7%</w:t>
+            </w:r>
+          </w:p>
+        </w:tc>
+        <w:tc>
+          <w:tcPr>
+            <w:tcW w:type="dxa" w:w="1440"/>
+            <w:shd w:fill="FFFFFF"/>
+            <w:tcMar>
+              <w:top w:w="100" w:type="dxa"/>
+              <w:bottom w:w="100" w:type="dxa"/>
+              <w:left w:w="140" w:type="dxa"/>
+              <w:right w:w="140" w:type="dxa"/>
+            </w:tcMar>
+            <w:vAlign w:val="center"/>
+          </w:tcPr>
+          <w:p>
+            <w:pPr>
+              <w:spacing w:before="0" w:after="0"/>
+              <w:jc w:val="right"/>
+            </w:pPr>
+            <w:r>
+              <w:rPr>
+                <w:rFonts w:ascii="Calibri" w:hAnsi="Calibri"/>
+                <w:color w:val="334155"/>
+                <w:sz w:val="19"/>
+              </w:rPr>
+              <w:t>NT$ 4.2M</w:t>
+            </w:r>
+          </w:p>
+        </w:tc>
+        <w:tc>
+          <w:tcPr>
+            <w:tcW w:type="dxa" w:w="1440"/>
+            <w:shd w:fill="FFFFFF"/>
+            <w:tcMar>
+              <w:top w:w="100" w:type="dxa"/>
+              <w:bottom w:w="100" w:type="dxa"/>
+              <w:left w:w="140" w:type="dxa"/>
+              <w:right w:w="140" w:type="dxa"/>
+            </w:tcMar>
+            <w:vAlign w:val="center"/>
+          </w:tcPr>
+          <w:p>
+            <w:pPr>
+              <w:spacing w:before="0" w:after="0"/>
+              <w:jc w:val="right"/>
+            </w:pPr>
+            <w:r>
+              <w:rPr>
+                <w:rFonts w:ascii="Calibri" w:hAnsi="Calibri"/>
+                <w:color w:val="334155"/>
+                <w:sz w:val="19"/>
+              </w:rPr>
+              <w:t>NT$ 0.5M</w:t>
+            </w:r>
+          </w:p>
+        </w:tc>
+        <w:tc>
+          <w:tcPr>
+            <w:tcW w:type="dxa" w:w="1584"/>
+            <w:shd w:fill="FFFFFF"/>
+            <w:tcMar>
+              <w:top w:w="100" w:type="dxa"/>
+              <w:bottom w:w="100" w:type="dxa"/>
+              <w:left w:w="140" w:type="dxa"/>
+              <w:right w:w="140" w:type="dxa"/>
+            </w:tcMar>
+            <w:vAlign w:val="center"/>
+          </w:tcPr>
+          <w:p>
+            <w:pPr>
+              <w:spacing w:before="0" w:after="0"/>
+              <w:jc w:val="right"/>
+            </w:pPr>
+            <w:r>
+              <w:rPr>
+                <w:rFonts w:ascii="Calibri" w:hAnsi="Calibri"/>
+                <w:color w:val="334155"/>
+                <w:sz w:val="19"/>
+              </w:rPr>
+              <w:t>+NT$ 3.7M</w:t>
+            </w:r>
+          </w:p>
+        </w:tc>
+      </w:tr>
+      <w:tr>
+        <w:tc>
+          <w:tcPr>
+            <w:tcW w:type="dxa" w:w="1584"/>
+            <w:shd w:fill="F8FAFC"/>
+            <w:tcMar>
+              <w:top w:w="100" w:type="dxa"/>
+              <w:bottom w:w="100" w:type="dxa"/>
+              <w:left w:w="140" w:type="dxa"/>
+              <w:right w:w="140" w:type="dxa"/>
+            </w:tcMar>
+            <w:vAlign w:val="center"/>
+          </w:tcPr>
+          <w:p>
+            <w:pPr>
+              <w:spacing w:before="0" w:after="0"/>
+            </w:pPr>
+            <w:r>
+              <w:rPr>
+                <w:rFonts w:ascii="Calibri" w:hAnsi="Calibri"/>
+                <w:b/>
+                <w:color w:val="334155"/>
+                <w:sz w:val="19"/>
+              </w:rPr>
+              <w:t>FICO 550</w:t>
+            </w:r>
+          </w:p>
+        </w:tc>
+        <w:tc>
+          <w:tcPr>
+            <w:tcW w:type="dxa" w:w="1152"/>
+            <w:shd w:fill="F8FAFC"/>
+            <w:tcMar>
+              <w:top w:w="100" w:type="dxa"/>
+              <w:bottom w:w="100" w:type="dxa"/>
+              <w:left w:w="140" w:type="dxa"/>
+              <w:right w:w="140" w:type="dxa"/>
+            </w:tcMar>
+            <w:vAlign w:val="center"/>
+          </w:tcPr>
+          <w:p>
+            <w:pPr>
+              <w:spacing w:before="0" w:after="0"/>
+              <w:jc w:val="right"/>
+            </w:pPr>
+            <w:r>
+              <w:rPr>
+                <w:rFonts w:ascii="Calibri" w:hAnsi="Calibri"/>
+                <w:color w:val="334155"/>
+                <w:sz w:val="19"/>
+              </w:rPr>
+              <w:t>91.6%</w:t>
+            </w:r>
+          </w:p>
+        </w:tc>
+        <w:tc>
+          <w:tcPr>
+            <w:tcW w:type="dxa" w:w="1296"/>
+            <w:shd w:fill="F8FAFC"/>
+            <w:tcMar>
+              <w:top w:w="100" w:type="dxa"/>
+              <w:bottom w:w="100" w:type="dxa"/>
+              <w:left w:w="140" w:type="dxa"/>
+              <w:right w:w="140" w:type="dxa"/>
+            </w:tcMar>
+            <w:vAlign w:val="center"/>
+          </w:tcPr>
+          <w:p>
+            <w:pPr>
+              <w:spacing w:before="0" w:after="0"/>
+              <w:jc w:val="right"/>
+            </w:pPr>
+            <w:r>
+              <w:rPr>
+                <w:rFonts w:ascii="Calibri" w:hAnsi="Calibri"/>
+                <w:color w:val="334155"/>
+                <w:sz w:val="19"/>
+              </w:rPr>
+              <w:t>5,496</w:t>
+            </w:r>
+          </w:p>
+        </w:tc>
+        <w:tc>
+          <w:tcPr>
+            <w:tcW w:type="dxa" w:w="1584"/>
+            <w:shd w:fill="F8FAFC"/>
+            <w:tcMar>
+              <w:top w:w="100" w:type="dxa"/>
+              <w:bottom w:w="100" w:type="dxa"/>
+              <w:left w:w="140" w:type="dxa"/>
+              <w:right w:w="140" w:type="dxa"/>
+            </w:tcMar>
+            <w:vAlign w:val="center"/>
+          </w:tcPr>
+          <w:p>
+            <w:pPr>
+              <w:spacing w:before="0" w:after="0"/>
+              <w:jc w:val="right"/>
+            </w:pPr>
+            <w:r>
+              <w:rPr>
+                <w:rFonts w:ascii="Calibri" w:hAnsi="Calibri"/>
+                <w:color w:val="334155"/>
+                <w:sz w:val="19"/>
+              </w:rPr>
+              <w:t>20.1%</w:t>
+            </w:r>
+          </w:p>
+        </w:tc>
+        <w:tc>
+          <w:tcPr>
+            <w:tcW w:type="dxa" w:w="1440"/>
+            <w:shd w:fill="F8FAFC"/>
+            <w:tcMar>
+              <w:top w:w="100" w:type="dxa"/>
+              <w:bottom w:w="100" w:type="dxa"/>
+              <w:left w:w="140" w:type="dxa"/>
+              <w:right w:w="140" w:type="dxa"/>
+            </w:tcMar>
+            <w:vAlign w:val="center"/>
+          </w:tcPr>
+          <w:p>
+            <w:pPr>
+              <w:spacing w:before="0" w:after="0"/>
+              <w:jc w:val="right"/>
+            </w:pPr>
+            <w:r>
+              <w:rPr>
+                <w:rFonts w:ascii="Calibri" w:hAnsi="Calibri"/>
+                <w:color w:val="334155"/>
+                <w:sz w:val="19"/>
+              </w:rPr>
+              <w:t>NT$ 14.8M</w:t>
+            </w:r>
+          </w:p>
+        </w:tc>
+        <w:tc>
+          <w:tcPr>
+            <w:tcW w:type="dxa" w:w="1440"/>
+            <w:shd w:fill="F8FAFC"/>
+            <w:tcMar>
+              <w:top w:w="100" w:type="dxa"/>
+              <w:bottom w:w="100" w:type="dxa"/>
+              <w:left w:w="140" w:type="dxa"/>
+              <w:right w:w="140" w:type="dxa"/>
+            </w:tcMar>
+            <w:vAlign w:val="center"/>
+          </w:tcPr>
+          <w:p>
+            <w:pPr>
+              <w:spacing w:before="0" w:after="0"/>
+              <w:jc w:val="right"/>
+            </w:pPr>
+            <w:r>
+              <w:rPr>
+                <w:rFonts w:ascii="Calibri" w:hAnsi="Calibri"/>
+                <w:color w:val="334155"/>
+                <w:sz w:val="19"/>
+              </w:rPr>
+              <w:t>NT$ 2.1M</w:t>
+            </w:r>
+          </w:p>
+        </w:tc>
+        <w:tc>
+          <w:tcPr>
+            <w:tcW w:type="dxa" w:w="1584"/>
+            <w:shd w:fill="F8FAFC"/>
+            <w:tcMar>
+              <w:top w:w="100" w:type="dxa"/>
+              <w:bottom w:w="100" w:type="dxa"/>
+              <w:left w:w="140" w:type="dxa"/>
+              <w:right w:w="140" w:type="dxa"/>
+            </w:tcMar>
+            <w:vAlign w:val="center"/>
+          </w:tcPr>
+          <w:p>
+            <w:pPr>
+              <w:spacing w:before="0" w:after="0"/>
+              <w:jc w:val="right"/>
+            </w:pPr>
+            <w:r>
+              <w:rPr>
+                <w:rFonts w:ascii="Calibri" w:hAnsi="Calibri"/>
+                <w:color w:val="334155"/>
+                <w:sz w:val="19"/>
+              </w:rPr>
+              <w:t>+NT$ 12.7M</w:t>
+            </w:r>
+          </w:p>
+        </w:tc>
+      </w:tr>
+      <w:tr>
+        <w:tc>
+          <w:tcPr>
+            <w:tcW w:type="dxa" w:w="1584"/>
+            <w:shd w:fill="FFFFFF"/>
+            <w:tcMar>
+              <w:top w:w="100" w:type="dxa"/>
+              <w:bottom w:w="100" w:type="dxa"/>
+              <w:left w:w="140" w:type="dxa"/>
+              <w:right w:w="140" w:type="dxa"/>
+            </w:tcMar>
+            <w:vAlign w:val="center"/>
+          </w:tcPr>
+          <w:p>
+            <w:pPr>
+              <w:spacing w:before="0" w:after="0"/>
+            </w:pPr>
+            <w:r>
+              <w:rPr>
+                <w:rFonts w:ascii="Calibri" w:hAnsi="Calibri"/>
+                <w:b/>
+                <w:color w:val="334155"/>
+                <w:sz w:val="19"/>
+              </w:rPr>
+              <w:t>FICO 600</w:t>
+            </w:r>
+          </w:p>
+        </w:tc>
+        <w:tc>
+          <w:tcPr>
+            <w:tcW w:type="dxa" w:w="1152"/>
+            <w:shd w:fill="FFFFFF"/>
+            <w:tcMar>
+              <w:top w:w="100" w:type="dxa"/>
+              <w:bottom w:w="100" w:type="dxa"/>
+              <w:left w:w="140" w:type="dxa"/>
+              <w:right w:w="140" w:type="dxa"/>
+            </w:tcMar>
+            <w:vAlign w:val="center"/>
+          </w:tcPr>
+          <w:p>
+            <w:pPr>
+              <w:spacing w:before="0" w:after="0"/>
+              <w:jc w:val="right"/>
+            </w:pPr>
+            <w:r>
+              <w:rPr>
+                <w:rFonts w:ascii="Calibri" w:hAnsi="Calibri"/>
+                <w:color w:val="334155"/>
+                <w:sz w:val="19"/>
+              </w:rPr>
+              <w:t>78.5%</w:t>
+            </w:r>
+          </w:p>
+        </w:tc>
+        <w:tc>
+          <w:tcPr>
+            <w:tcW w:type="dxa" w:w="1296"/>
+            <w:shd w:fill="FFFFFF"/>
+            <w:tcMar>
+              <w:top w:w="100" w:type="dxa"/>
+              <w:bottom w:w="100" w:type="dxa"/>
+              <w:left w:w="140" w:type="dxa"/>
+              <w:right w:w="140" w:type="dxa"/>
+            </w:tcMar>
+            <w:vAlign w:val="center"/>
+          </w:tcPr>
+          <w:p>
+            <w:pPr>
+              <w:spacing w:before="0" w:after="0"/>
+              <w:jc w:val="right"/>
+            </w:pPr>
+            <w:r>
+              <w:rPr>
+                <w:rFonts w:ascii="Calibri" w:hAnsi="Calibri"/>
+                <w:color w:val="334155"/>
+                <w:sz w:val="19"/>
+              </w:rPr>
+              <w:t>4,710</w:t>
+            </w:r>
+          </w:p>
+        </w:tc>
+        <w:tc>
+          <w:tcPr>
+            <w:tcW w:type="dxa" w:w="1584"/>
+            <w:shd w:fill="FFFFFF"/>
+            <w:tcMar>
+              <w:top w:w="100" w:type="dxa"/>
+              <w:bottom w:w="100" w:type="dxa"/>
+              <w:left w:w="140" w:type="dxa"/>
+              <w:right w:w="140" w:type="dxa"/>
+            </w:tcMar>
+            <w:vAlign w:val="center"/>
+          </w:tcPr>
+          <w:p>
+            <w:pPr>
+              <w:spacing w:before="0" w:after="0"/>
+              <w:jc w:val="right"/>
+            </w:pPr>
+            <w:r>
+              <w:rPr>
+                <w:rFonts w:ascii="Calibri" w:hAnsi="Calibri"/>
+                <w:color w:val="334155"/>
+                <w:sz w:val="19"/>
+              </w:rPr>
+              <w:t>16.8%</w:t>
+            </w:r>
+          </w:p>
+        </w:tc>
+        <w:tc>
+          <w:tcPr>
+            <w:tcW w:type="dxa" w:w="1440"/>
+            <w:shd w:fill="FFFFFF"/>
+            <w:tcMar>
+              <w:top w:w="100" w:type="dxa"/>
+              <w:bottom w:w="100" w:type="dxa"/>
+              <w:left w:w="140" w:type="dxa"/>
+              <w:right w:w="140" w:type="dxa"/>
+            </w:tcMar>
+            <w:vAlign w:val="center"/>
+          </w:tcPr>
+          <w:p>
+            <w:pPr>
+              <w:spacing w:before="0" w:after="0"/>
+              <w:jc w:val="right"/>
+            </w:pPr>
+            <w:r>
+              <w:rPr>
+                <w:rFonts w:ascii="Calibri" w:hAnsi="Calibri"/>
+                <w:color w:val="334155"/>
+                <w:sz w:val="19"/>
+              </w:rPr>
+              <w:t>NT$ 30.2M</w:t>
+            </w:r>
+          </w:p>
+        </w:tc>
+        <w:tc>
+          <w:tcPr>
+            <w:tcW w:type="dxa" w:w="1440"/>
+            <w:shd w:fill="FFFFFF"/>
+            <w:tcMar>
+              <w:top w:w="100" w:type="dxa"/>
+              <w:bottom w:w="100" w:type="dxa"/>
+              <w:left w:w="140" w:type="dxa"/>
+              <w:right w:w="140" w:type="dxa"/>
+            </w:tcMar>
+            <w:vAlign w:val="center"/>
+          </w:tcPr>
+          <w:p>
+            <w:pPr>
+              <w:spacing w:before="0" w:after="0"/>
+              <w:jc w:val="right"/>
+            </w:pPr>
+            <w:r>
+              <w:rPr>
+                <w:rFonts w:ascii="Calibri" w:hAnsi="Calibri"/>
+                <w:color w:val="334155"/>
+                <w:sz w:val="19"/>
+              </w:rPr>
+              <w:t>NT$ 4.8M</w:t>
+            </w:r>
+          </w:p>
+        </w:tc>
+        <w:tc>
+          <w:tcPr>
+            <w:tcW w:type="dxa" w:w="1584"/>
+            <w:shd w:fill="FFFFFF"/>
+            <w:tcMar>
+              <w:top w:w="100" w:type="dxa"/>
+              <w:bottom w:w="100" w:type="dxa"/>
+              <w:left w:w="140" w:type="dxa"/>
+              <w:right w:w="140" w:type="dxa"/>
+            </w:tcMar>
+            <w:vAlign w:val="center"/>
+          </w:tcPr>
+          <w:p>
+            <w:pPr>
+              <w:spacing w:before="0" w:after="0"/>
+              <w:jc w:val="right"/>
+            </w:pPr>
+            <w:r>
+              <w:rPr>
+                <w:rFonts w:ascii="Calibri" w:hAnsi="Calibri"/>
+                <w:color w:val="334155"/>
+                <w:sz w:val="19"/>
+              </w:rPr>
+              <w:t>+NT$ 25.4M</w:t>
+            </w:r>
+          </w:p>
+        </w:tc>
+      </w:tr>
+      <w:tr>
+        <w:tc>
+          <w:tcPr>
+            <w:tcW w:type="dxa" w:w="1584"/>
+            <w:shd w:fill="F8FAFC"/>
+            <w:tcMar>
+              <w:top w:w="100" w:type="dxa"/>
+              <w:bottom w:w="100" w:type="dxa"/>
+              <w:left w:w="140" w:type="dxa"/>
+              <w:right w:w="140" w:type="dxa"/>
+            </w:tcMar>
+            <w:vAlign w:val="center"/>
+          </w:tcPr>
+          <w:p>
+            <w:pPr>
+              <w:spacing w:before="0" w:after="0"/>
+            </w:pPr>
+            <w:r>
+              <w:rPr>
+                <w:rFonts w:ascii="Calibri" w:hAnsi="Calibri"/>
+                <w:b/>
+                <w:color w:val="334155"/>
+                <w:sz w:val="19"/>
+              </w:rPr>
+              <w:t>FICO 620 (Optimal)</w:t>
+            </w:r>
+          </w:p>
+        </w:tc>
+        <w:tc>
+          <w:tcPr>
+            <w:tcW w:type="dxa" w:w="1152"/>
+            <w:shd w:fill="F8FAFC"/>
+            <w:tcMar>
+              <w:top w:w="100" w:type="dxa"/>
+              <w:bottom w:w="100" w:type="dxa"/>
+              <w:left w:w="140" w:type="dxa"/>
+              <w:right w:w="140" w:type="dxa"/>
+            </w:tcMar>
+            <w:vAlign w:val="center"/>
+          </w:tcPr>
+          <w:p>
+            <w:pPr>
+              <w:spacing w:before="0" w:after="0"/>
+              <w:jc w:val="right"/>
+            </w:pPr>
+            <w:r>
+              <w:rPr>
+                <w:rFonts w:ascii="Calibri" w:hAnsi="Calibri"/>
+                <w:color w:val="334155"/>
+                <w:sz w:val="19"/>
+              </w:rPr>
+              <w:t>65.6%</w:t>
+            </w:r>
+          </w:p>
+        </w:tc>
+        <w:tc>
+          <w:tcPr>
+            <w:tcW w:type="dxa" w:w="1296"/>
+            <w:shd w:fill="F8FAFC"/>
+            <w:tcMar>
+              <w:top w:w="100" w:type="dxa"/>
+              <w:bottom w:w="100" w:type="dxa"/>
+              <w:left w:w="140" w:type="dxa"/>
+              <w:right w:w="140" w:type="dxa"/>
+            </w:tcMar>
+            <w:vAlign w:val="center"/>
+          </w:tcPr>
+          <w:p>
+            <w:pPr>
+              <w:spacing w:before="0" w:after="0"/>
+              <w:jc w:val="right"/>
+            </w:pPr>
+            <w:r>
+              <w:rPr>
+                <w:rFonts w:ascii="Calibri" w:hAnsi="Calibri"/>
+                <w:color w:val="334155"/>
+                <w:sz w:val="19"/>
+              </w:rPr>
+              <w:t>3,939</w:t>
+            </w:r>
+          </w:p>
+        </w:tc>
+        <w:tc>
+          <w:tcPr>
+            <w:tcW w:type="dxa" w:w="1584"/>
+            <w:shd w:fill="F8FAFC"/>
+            <w:tcMar>
+              <w:top w:w="100" w:type="dxa"/>
+              <w:bottom w:w="100" w:type="dxa"/>
+              <w:left w:w="140" w:type="dxa"/>
+              <w:right w:w="140" w:type="dxa"/>
+            </w:tcMar>
+            <w:vAlign w:val="center"/>
+          </w:tcPr>
+          <w:p>
+            <w:pPr>
+              <w:spacing w:before="0" w:after="0"/>
+              <w:jc w:val="right"/>
+            </w:pPr>
+            <w:r>
+              <w:rPr>
+                <w:rFonts w:ascii="Calibri" w:hAnsi="Calibri"/>
+                <w:color w:val="334155"/>
+                <w:sz w:val="19"/>
+              </w:rPr>
+              <w:t>11.4%</w:t>
+            </w:r>
+          </w:p>
+        </w:tc>
+        <w:tc>
+          <w:tcPr>
+            <w:tcW w:type="dxa" w:w="1440"/>
+            <w:shd w:fill="F8FAFC"/>
+            <w:tcMar>
+              <w:top w:w="100" w:type="dxa"/>
+              <w:bottom w:w="100" w:type="dxa"/>
+              <w:left w:w="140" w:type="dxa"/>
+              <w:right w:w="140" w:type="dxa"/>
+            </w:tcMar>
+            <w:vAlign w:val="center"/>
+          </w:tcPr>
+          <w:p>
+            <w:pPr>
+              <w:spacing w:before="0" w:after="0"/>
+              <w:jc w:val="right"/>
+            </w:pPr>
+            <w:r>
+              <w:rPr>
+                <w:rFonts w:ascii="Calibri" w:hAnsi="Calibri"/>
+                <w:color w:val="334155"/>
+                <w:sz w:val="19"/>
+              </w:rPr>
+              <w:t>NT$ 42.5M</w:t>
+            </w:r>
+          </w:p>
+        </w:tc>
+        <w:tc>
+          <w:tcPr>
+            <w:tcW w:type="dxa" w:w="1440"/>
+            <w:shd w:fill="F8FAFC"/>
+            <w:tcMar>
+              <w:top w:w="100" w:type="dxa"/>
+              <w:bottom w:w="100" w:type="dxa"/>
+              <w:left w:w="140" w:type="dxa"/>
+              <w:right w:w="140" w:type="dxa"/>
+            </w:tcMar>
+            <w:vAlign w:val="center"/>
+          </w:tcPr>
+          <w:p>
+            <w:pPr>
+              <w:spacing w:before="0" w:after="0"/>
+              <w:jc w:val="right"/>
+            </w:pPr>
+            <w:r>
+              <w:rPr>
+                <w:rFonts w:ascii="Calibri" w:hAnsi="Calibri"/>
+                <w:color w:val="334155"/>
+                <w:sz w:val="19"/>
+              </w:rPr>
+              <w:t>NT$ 6.5M</w:t>
+            </w:r>
+          </w:p>
+        </w:tc>
+        <w:tc>
+          <w:tcPr>
+            <w:tcW w:type="dxa" w:w="1584"/>
+            <w:shd w:fill="F8FAFC"/>
+            <w:tcMar>
+              <w:top w:w="100" w:type="dxa"/>
+              <w:bottom w:w="100" w:type="dxa"/>
+              <w:left w:w="140" w:type="dxa"/>
+              <w:right w:w="140" w:type="dxa"/>
+            </w:tcMar>
+            <w:vAlign w:val="center"/>
+          </w:tcPr>
+          <w:p>
+            <w:pPr>
+              <w:spacing w:before="0" w:after="0"/>
+              <w:jc w:val="right"/>
+            </w:pPr>
+            <w:r>
+              <w:rPr>
+                <w:rFonts w:ascii="Calibri" w:hAnsi="Calibri"/>
+                <w:color w:val="334155"/>
+                <w:sz w:val="19"/>
+              </w:rPr>
+              <w:t>+NT$ 36.0M</w:t>
+            </w:r>
+          </w:p>
+        </w:tc>
+      </w:tr>
+      <w:tr>
+        <w:tc>
+          <w:tcPr>
+            <w:tcW w:type="dxa" w:w="1584"/>
+            <w:shd w:fill="FFFFFF"/>
+            <w:tcMar>
+              <w:top w:w="100" w:type="dxa"/>
+              <w:bottom w:w="100" w:type="dxa"/>
+              <w:left w:w="140" w:type="dxa"/>
+              <w:right w:w="140" w:type="dxa"/>
+            </w:tcMar>
+            <w:vAlign w:val="center"/>
+          </w:tcPr>
+          <w:p>
+            <w:pPr>
+              <w:spacing w:before="0" w:after="0"/>
+            </w:pPr>
+            <w:r>
+              <w:rPr>
+                <w:rFonts w:ascii="Calibri" w:hAnsi="Calibri"/>
+                <w:b/>
+                <w:color w:val="334155"/>
+                <w:sz w:val="19"/>
+              </w:rPr>
+              <w:t>FICO 660 (Near-Prime)</w:t>
+            </w:r>
+          </w:p>
+        </w:tc>
+        <w:tc>
+          <w:tcPr>
+            <w:tcW w:type="dxa" w:w="1152"/>
+            <w:shd w:fill="FFFFFF"/>
+            <w:tcMar>
+              <w:top w:w="100" w:type="dxa"/>
+              <w:bottom w:w="100" w:type="dxa"/>
+              <w:left w:w="140" w:type="dxa"/>
+              <w:right w:w="140" w:type="dxa"/>
+            </w:tcMar>
+            <w:vAlign w:val="center"/>
+          </w:tcPr>
+          <w:p>
+            <w:pPr>
+              <w:spacing w:before="0" w:after="0"/>
+              <w:jc w:val="right"/>
+            </w:pPr>
+            <w:r>
+              <w:rPr>
+                <w:rFonts w:ascii="Calibri" w:hAnsi="Calibri"/>
+                <w:color w:val="334155"/>
+                <w:sz w:val="19"/>
+              </w:rPr>
+              <w:t>48.3%</w:t>
+            </w:r>
+          </w:p>
+        </w:tc>
+        <w:tc>
+          <w:tcPr>
+            <w:tcW w:type="dxa" w:w="1296"/>
+            <w:shd w:fill="FFFFFF"/>
+            <w:tcMar>
+              <w:top w:w="100" w:type="dxa"/>
+              <w:bottom w:w="100" w:type="dxa"/>
+              <w:left w:w="140" w:type="dxa"/>
+              <w:right w:w="140" w:type="dxa"/>
+            </w:tcMar>
+            <w:vAlign w:val="center"/>
+          </w:tcPr>
+          <w:p>
+            <w:pPr>
+              <w:spacing w:before="0" w:after="0"/>
+              <w:jc w:val="right"/>
+            </w:pPr>
+            <w:r>
+              <w:rPr>
+                <w:rFonts w:ascii="Calibri" w:hAnsi="Calibri"/>
+                <w:color w:val="334155"/>
+                <w:sz w:val="19"/>
+              </w:rPr>
+              <w:t>2,898</w:t>
+            </w:r>
+          </w:p>
+        </w:tc>
+        <w:tc>
+          <w:tcPr>
+            <w:tcW w:type="dxa" w:w="1584"/>
+            <w:shd w:fill="FFFFFF"/>
+            <w:tcMar>
+              <w:top w:w="100" w:type="dxa"/>
+              <w:bottom w:w="100" w:type="dxa"/>
+              <w:left w:w="140" w:type="dxa"/>
+              <w:right w:w="140" w:type="dxa"/>
+            </w:tcMar>
+            <w:vAlign w:val="center"/>
+          </w:tcPr>
+          <w:p>
+            <w:pPr>
+              <w:spacing w:before="0" w:after="0"/>
+              <w:jc w:val="right"/>
+            </w:pPr>
+            <w:r>
+              <w:rPr>
+                <w:rFonts w:ascii="Calibri" w:hAnsi="Calibri"/>
+                <w:color w:val="334155"/>
+                <w:sz w:val="19"/>
+              </w:rPr>
+              <w:t>8.9%</w:t>
+            </w:r>
+          </w:p>
+        </w:tc>
+        <w:tc>
+          <w:tcPr>
+            <w:tcW w:type="dxa" w:w="1440"/>
+            <w:shd w:fill="FFFFFF"/>
+            <w:tcMar>
+              <w:top w:w="100" w:type="dxa"/>
+              <w:bottom w:w="100" w:type="dxa"/>
+              <w:left w:w="140" w:type="dxa"/>
+              <w:right w:w="140" w:type="dxa"/>
+            </w:tcMar>
+            <w:vAlign w:val="center"/>
+          </w:tcPr>
+          <w:p>
+            <w:pPr>
+              <w:spacing w:before="0" w:after="0"/>
+              <w:jc w:val="right"/>
+            </w:pPr>
+            <w:r>
+              <w:rPr>
+                <w:rFonts w:ascii="Calibri" w:hAnsi="Calibri"/>
+                <w:color w:val="334155"/>
+                <w:sz w:val="19"/>
+              </w:rPr>
+              <w:t>NT$ 61.2M</w:t>
+            </w:r>
+          </w:p>
+        </w:tc>
+        <w:tc>
+          <w:tcPr>
+            <w:tcW w:type="dxa" w:w="1440"/>
+            <w:shd w:fill="FFFFFF"/>
+            <w:tcMar>
+              <w:top w:w="100" w:type="dxa"/>
+              <w:bottom w:w="100" w:type="dxa"/>
+              <w:left w:w="140" w:type="dxa"/>
+              <w:right w:w="140" w:type="dxa"/>
+            </w:tcMar>
+            <w:vAlign w:val="center"/>
+          </w:tcPr>
+          <w:p>
+            <w:pPr>
+              <w:spacing w:before="0" w:after="0"/>
+              <w:jc w:val="right"/>
+            </w:pPr>
+            <w:r>
+              <w:rPr>
+                <w:rFonts w:ascii="Calibri" w:hAnsi="Calibri"/>
+                <w:color w:val="334155"/>
+                <w:sz w:val="19"/>
+              </w:rPr>
+              <w:t>NT$ 14.1M</w:t>
+            </w:r>
+          </w:p>
+        </w:tc>
+        <w:tc>
+          <w:tcPr>
+            <w:tcW w:type="dxa" w:w="1584"/>
+            <w:shd w:fill="FFFFFF"/>
+            <w:tcMar>
+              <w:top w:w="100" w:type="dxa"/>
+              <w:bottom w:w="100" w:type="dxa"/>
+              <w:left w:w="140" w:type="dxa"/>
+              <w:right w:w="140" w:type="dxa"/>
+            </w:tcMar>
+            <w:vAlign w:val="center"/>
+          </w:tcPr>
+          <w:p>
+            <w:pPr>
+              <w:spacing w:before="0" w:after="0"/>
+              <w:jc w:val="right"/>
+            </w:pPr>
+            <w:r>
+              <w:rPr>
+                <w:rFonts w:ascii="Calibri" w:hAnsi="Calibri"/>
+                <w:color w:val="334155"/>
+                <w:sz w:val="19"/>
+              </w:rPr>
+              <w:t>+NT$ 47.1M</w:t>
+            </w:r>
+          </w:p>
+        </w:tc>
+      </w:tr>
+      <w:tr>
+        <w:tc>
+          <w:tcPr>
+            <w:tcW w:type="dxa" w:w="1584"/>
+            <w:shd w:fill="F8FAFC"/>
+            <w:tcMar>
+              <w:top w:w="100" w:type="dxa"/>
+              <w:bottom w:w="100" w:type="dxa"/>
+              <w:left w:w="140" w:type="dxa"/>
+              <w:right w:w="140" w:type="dxa"/>
+            </w:tcMar>
+            <w:vAlign w:val="center"/>
+          </w:tcPr>
+          <w:p>
+            <w:pPr>
+              <w:spacing w:before="0" w:after="0"/>
+            </w:pPr>
+            <w:r>
+              <w:rPr>
+                <w:rFonts w:ascii="Calibri" w:hAnsi="Calibri"/>
+                <w:b/>
+                <w:color w:val="334155"/>
+                <w:sz w:val="19"/>
+              </w:rPr>
+              <w:t>FICO 720 (Prime Only)</w:t>
+            </w:r>
+          </w:p>
+        </w:tc>
+        <w:tc>
+          <w:tcPr>
+            <w:tcW w:type="dxa" w:w="1152"/>
+            <w:shd w:fill="F8FAFC"/>
+            <w:tcMar>
+              <w:top w:w="100" w:type="dxa"/>
+              <w:bottom w:w="100" w:type="dxa"/>
+              <w:left w:w="140" w:type="dxa"/>
+              <w:right w:w="140" w:type="dxa"/>
+            </w:tcMar>
+            <w:vAlign w:val="center"/>
+          </w:tcPr>
+          <w:p>
+            <w:pPr>
+              <w:spacing w:before="0" w:after="0"/>
+              <w:jc w:val="right"/>
+            </w:pPr>
+            <w:r>
+              <w:rPr>
+                <w:rFonts w:ascii="Calibri" w:hAnsi="Calibri"/>
+                <w:color w:val="334155"/>
+                <w:sz w:val="19"/>
+              </w:rPr>
+              <w:t>23.8%</w:t>
+            </w:r>
+          </w:p>
+        </w:tc>
+        <w:tc>
+          <w:tcPr>
+            <w:tcW w:type="dxa" w:w="1296"/>
+            <w:shd w:fill="F8FAFC"/>
+            <w:tcMar>
+              <w:top w:w="100" w:type="dxa"/>
+              <w:bottom w:w="100" w:type="dxa"/>
+              <w:left w:w="140" w:type="dxa"/>
+              <w:right w:w="140" w:type="dxa"/>
+            </w:tcMar>
+            <w:vAlign w:val="center"/>
+          </w:tcPr>
+          <w:p>
+            <w:pPr>
+              <w:spacing w:before="0" w:after="0"/>
+              <w:jc w:val="right"/>
+            </w:pPr>
+            <w:r>
+              <w:rPr>
+                <w:rFonts w:ascii="Calibri" w:hAnsi="Calibri"/>
+                <w:color w:val="334155"/>
+                <w:sz w:val="19"/>
+              </w:rPr>
+              <w:t>1,428</w:t>
+            </w:r>
+          </w:p>
+        </w:tc>
+        <w:tc>
+          <w:tcPr>
+            <w:tcW w:type="dxa" w:w="1584"/>
+            <w:shd w:fill="F8FAFC"/>
+            <w:tcMar>
+              <w:top w:w="100" w:type="dxa"/>
+              <w:bottom w:w="100" w:type="dxa"/>
+              <w:left w:w="140" w:type="dxa"/>
+              <w:right w:w="140" w:type="dxa"/>
+            </w:tcMar>
+            <w:vAlign w:val="center"/>
+          </w:tcPr>
+          <w:p>
+            <w:pPr>
+              <w:spacing w:before="0" w:after="0"/>
+              <w:jc w:val="right"/>
+            </w:pPr>
+            <w:r>
+              <w:rPr>
+                <w:rFonts w:ascii="Calibri" w:hAnsi="Calibri"/>
+                <w:color w:val="334155"/>
+                <w:sz w:val="19"/>
+              </w:rPr>
+              <w:t>4.2%</w:t>
+            </w:r>
+          </w:p>
+        </w:tc>
+        <w:tc>
+          <w:tcPr>
+            <w:tcW w:type="dxa" w:w="1440"/>
+            <w:shd w:fill="F8FAFC"/>
+            <w:tcMar>
+              <w:top w:w="100" w:type="dxa"/>
+              <w:bottom w:w="100" w:type="dxa"/>
+              <w:left w:w="140" w:type="dxa"/>
+              <w:right w:w="140" w:type="dxa"/>
+            </w:tcMar>
+            <w:vAlign w:val="center"/>
+          </w:tcPr>
+          <w:p>
+            <w:pPr>
+              <w:spacing w:before="0" w:after="0"/>
+              <w:jc w:val="right"/>
+            </w:pPr>
+            <w:r>
+              <w:rPr>
+                <w:rFonts w:ascii="Calibri" w:hAnsi="Calibri"/>
+                <w:color w:val="334155"/>
+                <w:sz w:val="19"/>
+              </w:rPr>
+              <w:t>NT$ 82.4M</w:t>
+            </w:r>
+          </w:p>
+        </w:tc>
+        <w:tc>
+          <w:tcPr>
+            <w:tcW w:type="dxa" w:w="1440"/>
+            <w:shd w:fill="F8FAFC"/>
+            <w:tcMar>
+              <w:top w:w="100" w:type="dxa"/>
+              <w:bottom w:w="100" w:type="dxa"/>
+              <w:left w:w="140" w:type="dxa"/>
+              <w:right w:w="140" w:type="dxa"/>
+            </w:tcMar>
+            <w:vAlign w:val="center"/>
+          </w:tcPr>
+          <w:p>
+            <w:pPr>
+              <w:spacing w:before="0" w:after="0"/>
+              <w:jc w:val="right"/>
+            </w:pPr>
+            <w:r>
+              <w:rPr>
+                <w:rFonts w:ascii="Calibri" w:hAnsi="Calibri"/>
+                <w:color w:val="334155"/>
+                <w:sz w:val="19"/>
+              </w:rPr>
+              <w:t>NT$ 29.5M</w:t>
+            </w:r>
+          </w:p>
+        </w:tc>
+        <w:tc>
+          <w:tcPr>
+            <w:tcW w:type="dxa" w:w="1584"/>
+            <w:shd w:fill="F8FAFC"/>
+            <w:tcMar>
+              <w:top w:w="100" w:type="dxa"/>
+              <w:bottom w:w="100" w:type="dxa"/>
+              <w:left w:w="140" w:type="dxa"/>
+              <w:right w:w="140" w:type="dxa"/>
+            </w:tcMar>
+            <w:vAlign w:val="center"/>
+          </w:tcPr>
+          <w:p>
+            <w:pPr>
+              <w:spacing w:before="0" w:after="0"/>
+              <w:jc w:val="right"/>
+            </w:pPr>
+            <w:r>
+              <w:rPr>
+                <w:rFonts w:ascii="Calibri" w:hAnsi="Calibri"/>
+                <w:color w:val="334155"/>
+                <w:sz w:val="19"/>
+              </w:rPr>
+              <w:t>+NT$ 52.9M</w:t>
+            </w:r>
+          </w:p>
+        </w:tc>
+      </w:tr>
+    </w:tbl>
+    <w:p>
+      <w:pPr>
+        <w:spacing w:after="160"/>
+      </w:pPr>
+    </w:p>
+    <w:p>
+      <w:pPr>
+        <w:pStyle w:val="Heading2"/>
+      </w:pPr>
+      <w:r>
+        <w:t>10.2 Whole-Book Population Tape Simulation Schedule (30,000 Accounts)</w:t>
+      </w:r>
+    </w:p>
+    <w:p>
+      <w:r>
+        <w:t>Commercial simulation across the bank's entire portfolio tape (24k training + 6k test accounts combined, N=30,000):</w:t>
       </w:r>
     </w:p>
     <w:tbl>
@@ -6670,7 +8061,7 @@
                 <w:color w:val="334155"/>
                 <w:sz w:val="19"/>
               </w:rPr>
-              <w:t>19,620</w:t>
+              <w:t>19,614</w:t>
             </w:r>
           </w:p>
         </w:tc>
@@ -6697,7 +8088,7 @@
                 <w:color w:val="334155"/>
                 <w:sz w:val="19"/>
               </w:rPr>
-              <w:t>14.1%</w:t>
+              <w:t>7.7%</w:t>
             </w:r>
           </w:p>
         </w:tc>
@@ -6724,7 +8115,7 @@
                 <w:color w:val="334155"/>
                 <w:sz w:val="19"/>
               </w:rPr>
-              <w:t>NT$ 254.8M</w:t>
+              <w:t>NT$ 232.9M</w:t>
             </w:r>
           </w:p>
         </w:tc>
@@ -6751,7 +8142,7 @@
                 <w:color w:val="334155"/>
                 <w:sz w:val="19"/>
               </w:rPr>
-              <w:t>NT$ 48.2M</w:t>
+              <w:t>NT$ 26.2M</w:t>
             </w:r>
           </w:p>
         </w:tc>
@@ -6888,7 +8279,7 @@
                 <w:color w:val="334155"/>
                 <w:sz w:val="19"/>
               </w:rPr>
-              <w:t>10.5%</w:t>
+              <w:t>5.1%</w:t>
             </w:r>
           </w:p>
         </w:tc>
@@ -6915,7 +8306,7 @@
                 <w:color w:val="334155"/>
                 <w:sz w:val="19"/>
               </w:rPr>
-              <w:t>NT$ 382.1M</w:t>
+              <w:t>NT$ 312.5M</w:t>
             </w:r>
           </w:p>
         </w:tc>
@@ -6942,7 +8333,7 @@
                 <w:color w:val="334155"/>
                 <w:sz w:val="19"/>
               </w:rPr>
-              <w:t>NT$ 89.4M</w:t>
+              <w:t>NT$ 58.4M</w:t>
             </w:r>
           </w:p>
         </w:tc>
@@ -6969,7 +8360,7 @@
                 <w:color w:val="334155"/>
                 <w:sz w:val="19"/>
               </w:rPr>
-              <w:t>+NT$ 292.7M</w:t>
+              <w:t>+NT$ 254.1M</w:t>
             </w:r>
           </w:p>
         </w:tc>
@@ -7079,7 +8470,7 @@
                 <w:color w:val="334155"/>
                 <w:sz w:val="19"/>
               </w:rPr>
-              <w:t>5.8%</w:t>
+              <w:t>2.6%</w:t>
             </w:r>
           </w:p>
         </w:tc>
@@ -7106,7 +8497,7 @@
                 <w:color w:val="334155"/>
                 <w:sz w:val="19"/>
               </w:rPr>
-              <w:t>NT$ 512.4M</w:t>
+              <w:t>NT$ 418.2M</w:t>
             </w:r>
           </w:p>
         </w:tc>
@@ -7133,7 +8524,7 @@
                 <w:color w:val="334155"/>
                 <w:sz w:val="19"/>
               </w:rPr>
-              <w:t>NT$ 184.2M</w:t>
+              <w:t>NT$ 124.5M</w:t>
             </w:r>
           </w:p>
         </w:tc>
@@ -7160,7 +8551,7 @@
                 <w:color w:val="334155"/>
                 <w:sz w:val="19"/>
               </w:rPr>
-              <w:t>+NT$ 328.2M</w:t>
+              <w:t>+NT$ 293.7M</w:t>
             </w:r>
           </w:p>
         </w:tc>
@@ -7219,9 +8610,13 @@
                 <w:color w:val="334155"/>
                 <w:sz w:val="20"/>
               </w:rPr>
-              <w:t>Optimal Policy Recommendation:</w:t>
+              <w:t>Optimal Policy Recommendation &amp; Methodology Integrity:</w:t>
               <w:br/>
-              <w:t>The FICO 620 cutoff represents the institutional 'sweet-spot'. It preserves 65.4% of customer acquisition volume, reduces approved default rates from 22.1% down to 14.1%, and yields NT$ 206.6M in net commercial benefit. While cutoffs at 660+ prevent more losses, they severely constrict loan origination volume and client franchise value.</w:t>
+              <w:t>• On completely unseen accounts at FICO 620, the model achieves a 65.6% approval rate, cuts approved default rates nearly in half from 22.12% down to 11.35%, and intercepts NT$ 42.5M in bad debt on the 6k sample alone (scaling to NT$ 180M+ portfolio-wide).</w:t>
+              <w:br/>
+              <w:t>• When simulated across the bank's whole 30,000-account population tape, the approved default rate drops to 7.73%, avoiding NT$ 232.9M in bad debt.</w:t>
+              <w:br/>
+              <w:t>This dual-schedule presentation ensures 100% honesty when discussing out-of-sample rigor with technical interviewers.</w:t>
             </w:r>
           </w:p>
         </w:tc>
@@ -7321,7 +8716,7 @@
           <w:color w:val="334155"/>
           <w:sz w:val="20"/>
         </w:rPr>
-        <w:t>“Risk management isn't about eliminating all defaults—that would mean zero loan volume and zero profit! We built an Underwriting Policy Simulator that models the net financial benefit: (Bad Debt Prevented) minus (Lost Interest on Good Borrowers). Setting our cutoff at FICO 620 approved 65.4% of applicants while driving the approved default rate down from 22.1% to 14.1%, delivering NT$ 206M in net economic value.”</w:t>
+        <w:t>“Risk management isn't about eliminating all defaults—that would mean zero loan volume and zero profit! We built an Underwriting Policy Simulator that models the net financial benefit: (Bad Debt Prevented) minus (Lost Interest on Good Borrowers). Setting our cutoff at FICO 620 on unseen test data achieves a 65.6% approval rate, cuts the default rate nearly in half from 22.1% to 11.4%, and avoids NT$ 42.5M in bad debt on the test set alone (scaling to NT$ 180M+ portfolio-wide). When simulated across the bank's entire 30,000 population tape, the approved default rate drops to 7.7%, avoiding NT$ 232.9M in bad debt and delivering NT$ 206.6M in net commercial benefit.”</w:t>
       </w:r>
     </w:p>
     <w:p>

</xml_diff>

<commit_message>
fix: enforce metric consistency across README, app, Word report, and Basel III Excel schedule
</commit_message>
<xml_diff>
--- a/reports/CreditLens_Comprehensive_Model_Report.docx
+++ b/reports/CreditLens_Comprehensive_Model_Report.docx
@@ -395,7 +395,7 @@
                 <w:color w:val="334155"/>
                 <w:sz w:val="20"/>
               </w:rPr>
-              <w:t>The Champion Random Forest model delivered an ROC-AUC of 0.7781 and a Kolmogorov-Smirnov (KS) statistic of 42.57%, generating an +8.3% relative lift in risk separation power over traditional linear scorecards. Translated into commercial bank economics on 6,000 unseen test borrowers, this predictive edge intercepted NT$ 128.2M in severe default write-offs while maintaining loan approval volumes at 65.4%, creating a net commercial value of NT$ 114.1M.</w:t>
+              <w:t>The Champion Random Forest model delivered an ROC-AUC of 0.7781 and a Kolmogorov-Smirnov (KS) statistic of 42.57%, generating a +8.4% relative lift in risk separation power over traditional linear scorecards. Translated into commercial bank economics on 6,000 unseen test borrowers, applying a FICO 620 cutoff intercepted NT$ 42.5M in severe default write-offs while maintaining loan approval volumes at 65.6%, creating a net commercial value of NT$ 36.0M (extrapolated holdout x5: +NT$ 180.2M).</w:t>
             </w:r>
           </w:p>
         </w:tc>
@@ -818,7 +818,7 @@
                 <w:color w:val="334155"/>
                 <w:sz w:val="19"/>
               </w:rPr>
-              <w:t>+3.29% (+8.3%)</w:t>
+              <w:t>+3.29 points (+8.4%)</w:t>
             </w:r>
           </w:p>
         </w:tc>
@@ -2490,7 +2490,7 @@
                 <w:color w:val="334155"/>
                 <w:sz w:val="19"/>
               </w:rPr>
-              <w:t>+NT$ 48.5M Interest Revenue</w:t>
+              <w:t>+NT$ 32.2M Interest Revenue</w:t>
             </w:r>
           </w:p>
         </w:tc>
@@ -2516,7 +2516,7 @@
                 <w:color w:val="334155"/>
                 <w:sz w:val="19"/>
               </w:rPr>
-              <w:t>Safe borrowers approved for revolving credit; yield 15% APR and merchant interchange.</w:t>
+              <w:t>Safe borrowers approved for revolving credit; yield 15% APR on NT$ 214.9M safe balances.</w:t>
             </w:r>
           </w:p>
         </w:tc>
@@ -2623,7 +2623,7 @@
                 <w:color w:val="334155"/>
                 <w:sz w:val="19"/>
               </w:rPr>
-              <w:t>NT$ 128.2M Bad Debt Avoided</w:t>
+              <w:t>NT$ 38.4M Bad Debt Avoided</w:t>
             </w:r>
           </w:p>
         </w:tc>
@@ -2756,7 +2756,7 @@
                 <w:color w:val="334155"/>
                 <w:sz w:val="19"/>
               </w:rPr>
-              <w:t>-NT$ 14.1M Lost APR Income</w:t>
+              <w:t>-NT$ 4.2M Lost APR Income</w:t>
             </w:r>
           </w:p>
         </w:tc>
@@ -2889,7 +2889,7 @@
                 <w:color w:val="334155"/>
                 <w:sz w:val="19"/>
               </w:rPr>
-              <w:t>NT$ 42.8M Absorbed in Reserves</w:t>
+              <w:t>NT$ 28.9M Absorbed in Reserves</w:t>
             </w:r>
           </w:p>
         </w:tc>
@@ -2978,9 +2978,9 @@
               <w:br/>
               <w:t>Net Value Created = (Bad Debt Avoided) - (Lost Interest Opportunity)</w:t>
               <w:br/>
-              <w:t>Net Value = NT$ 128.2M - NT$ 14.1M = +NT$ 114.1M in Net Preserved Capital.</w:t>
+              <w:t>Net Value = NT$ 38.4M - NT$ 4.2M = +NT$ 34.1M in Net Preserved Capital.</w:t>
               <w:br/>
-              <w:t>For every NT$ 1 lost to conservative false-positive underwriting, the model saves NT$ 9.10 in bad-debt write-offs.</w:t>
+              <w:t>For every NT$ 1 lost to conservative false-positive underwriting, the model saves NT$ 9.08 in bad-debt write-offs.</w:t>
             </w:r>
           </w:p>
         </w:tc>
@@ -4667,9 +4667,9 @@
     </w:p>
     <w:p>
       <w:r>
-        <w:t>1. Delinquency Inception Trigger (PAY_0 ≥ 1): Any 30-day past-due event triggers an immediate alert. Historical data demonstrates that a 1-month delay increases default probability by 4.2x (jumping from 12.9% to 54.3%).</w:t>
+        <w:t>1. Delinquency Inception Trigger (PAY_0 ≥ 1): Any 30-day past-due event triggers an immediate alert. Historical data demonstrates that a 1-month payment delay gives a default rate of 50.3% vs 13.8% for timely accounts (3.6x surge), while a 2+ month delay jumps to 69.6% vs 16.6% (4.2x multiplier).</w:t>
         <w:br/>
-        <w:t>2. Credit Strain Danger Zone (Utilization &gt; 80%): Borrowers utilizing &gt;80% of their line default at 34.2% (2.1x higher than the 16.5% rate of borrowers maintaining ≤30% utilization).</w:t>
+        <w:t>2. Credit Strain Danger Zone (Utilization &gt; 80%): Borrowers utilizing &gt;80% of their line default at 31.9% (1.8x higher than the 17.9% rate of borrowers maintaining ≤30% utilization).</w:t>
         <w:br/>
         <w:t>3. Delinquency Velocity Acceleration (Trend &gt; 0): Accounts with worsening delinquency roll-rates are flagged for preemptive line capping before the borrower reaches 60-day DPD.</w:t>
       </w:r>
@@ -4711,6 +4711,15 @@
         <w:t xml:space="preserve">      • LGD (Loss Given Default): 45% standardized regulatory benchmark for unsecured consumer credit</w:t>
         <w:br/>
         <w:t xml:space="preserve">      • CAR (Capital Adequacy Ratio): 12.5% target maintaining a 4.5% conservative buffer above 8.0% Basel minimum</w:t>
+      </w:r>
+    </w:p>
+    <w:p>
+      <w:r>
+        <w:t>Empirical Basel III Portfolio ECL Reserves:</w:t>
+        <w:br/>
+        <w:t>• Out-of-Sample Holdout (6,000 Unseen Accounts): Total Exposure at Default (EAD) is NT$ 450.9M, generating an Expected Credit Loss reserve of NT$ 71.4M (15.8% coverage).</w:t>
+        <w:br/>
+        <w:t>• Full Population Tape (30,000 Accounts): Total EAD is NT$ 2239.4M, generating an Expected Credit Loss reserve of NT$ 352.2M (15.7% coverage).</w:t>
       </w:r>
     </w:p>
     <w:p>
@@ -5816,7 +5825,7 @@
     </w:p>
     <w:p>
       <w:r>
-        <w:t>Evaluated strictly on the 20% holdout test partition (N=6,000 accounts, 1,327 actual defaulters) that the model never saw during training:</w:t>
+        <w:t>Evaluated strictly on the 20% holdout test partition (N=6,000 accounts, 1,327 actual defaulters) that the model never saw during training (labeled holdout unseen):</w:t>
       </w:r>
     </w:p>
     <w:tbl>
@@ -6083,7 +6092,7 @@
                 <w:color w:val="334155"/>
                 <w:sz w:val="19"/>
               </w:rPr>
-              <w:t>98.1%</w:t>
+              <w:t>82.7%</w:t>
             </w:r>
           </w:p>
         </w:tc>
@@ -6110,7 +6119,7 @@
                 <w:color w:val="334155"/>
                 <w:sz w:val="19"/>
               </w:rPr>
-              <w:t>5,886</w:t>
+              <w:t>4,960</w:t>
             </w:r>
           </w:p>
         </w:tc>
@@ -6137,7 +6146,7 @@
                 <w:color w:val="334155"/>
                 <w:sz w:val="19"/>
               </w:rPr>
-              <w:t>21.7%</w:t>
+              <w:t>14.5%</w:t>
             </w:r>
           </w:p>
         </w:tc>
@@ -6164,7 +6173,7 @@
                 <w:color w:val="334155"/>
                 <w:sz w:val="19"/>
               </w:rPr>
-              <w:t>NT$ 4.2M</w:t>
+              <w:t>NT$ 33.2M</w:t>
             </w:r>
           </w:p>
         </w:tc>
@@ -6191,7 +6200,7 @@
                 <w:color w:val="334155"/>
                 <w:sz w:val="19"/>
               </w:rPr>
-              <w:t>NT$ 0.5M</w:t>
+              <w:t>NT$ 2.8M</w:t>
             </w:r>
           </w:p>
         </w:tc>
@@ -6218,7 +6227,7 @@
                 <w:color w:val="334155"/>
                 <w:sz w:val="19"/>
               </w:rPr>
-              <w:t>+NT$ 3.7M</w:t>
+              <w:t>+NT$ 30.4M</w:t>
             </w:r>
           </w:p>
         </w:tc>
@@ -6274,7 +6283,7 @@
                 <w:color w:val="334155"/>
                 <w:sz w:val="19"/>
               </w:rPr>
-              <w:t>91.6%</w:t>
+              <w:t>77.9%</w:t>
             </w:r>
           </w:p>
         </w:tc>
@@ -6301,7 +6310,7 @@
                 <w:color w:val="334155"/>
                 <w:sz w:val="19"/>
               </w:rPr>
-              <w:t>5,496</w:t>
+              <w:t>4,672</w:t>
             </w:r>
           </w:p>
         </w:tc>
@@ -6328,7 +6337,7 @@
                 <w:color w:val="334155"/>
                 <w:sz w:val="19"/>
               </w:rPr>
-              <w:t>20.1%</w:t>
+              <w:t>13.0%</w:t>
             </w:r>
           </w:p>
         </w:tc>
@@ -6355,7 +6364,7 @@
                 <w:color w:val="334155"/>
                 <w:sz w:val="19"/>
               </w:rPr>
-              <w:t>NT$ 14.8M</w:t>
+              <w:t>NT$ 37.1M</w:t>
             </w:r>
           </w:p>
         </w:tc>
@@ -6382,7 +6391,7 @@
                 <w:color w:val="334155"/>
                 <w:sz w:val="19"/>
               </w:rPr>
-              <w:t>NT$ 2.1M</w:t>
+              <w:t>NT$ 3.6M</w:t>
             </w:r>
           </w:p>
         </w:tc>
@@ -6409,7 +6418,7 @@
                 <w:color w:val="334155"/>
                 <w:sz w:val="19"/>
               </w:rPr>
-              <w:t>+NT$ 12.7M</w:t>
+              <w:t>+NT$ 33.5M</w:t>
             </w:r>
           </w:p>
         </w:tc>
@@ -6465,7 +6474,7 @@
                 <w:color w:val="334155"/>
                 <w:sz w:val="19"/>
               </w:rPr>
-              <w:t>78.5%</w:t>
+              <w:t>70.4%</w:t>
             </w:r>
           </w:p>
         </w:tc>
@@ -6492,7 +6501,7 @@
                 <w:color w:val="334155"/>
                 <w:sz w:val="19"/>
               </w:rPr>
-              <w:t>4,710</w:t>
+              <w:t>4,225</w:t>
             </w:r>
           </w:p>
         </w:tc>
@@ -6519,7 +6528,7 @@
                 <w:color w:val="334155"/>
                 <w:sz w:val="19"/>
               </w:rPr>
-              <w:t>16.8%</w:t>
+              <w:t>11.8%</w:t>
             </w:r>
           </w:p>
         </w:tc>
@@ -6546,7 +6555,7 @@
                 <w:color w:val="334155"/>
                 <w:sz w:val="19"/>
               </w:rPr>
-              <w:t>NT$ 30.2M</w:t>
+              <w:t>NT$ 40.2M</w:t>
             </w:r>
           </w:p>
         </w:tc>
@@ -6573,7 +6582,7 @@
                 <w:color w:val="334155"/>
                 <w:sz w:val="19"/>
               </w:rPr>
-              <w:t>NT$ 4.8M</w:t>
+              <w:t>NT$ 5.1M</w:t>
             </w:r>
           </w:p>
         </w:tc>
@@ -6600,7 +6609,7 @@
                 <w:color w:val="334155"/>
                 <w:sz w:val="19"/>
               </w:rPr>
-              <w:t>+NT$ 25.4M</w:t>
+              <w:t>+NT$ 35.1M</w:t>
             </w:r>
           </w:p>
         </w:tc>
@@ -6710,7 +6719,7 @@
                 <w:color w:val="334155"/>
                 <w:sz w:val="19"/>
               </w:rPr>
-              <w:t>11.4%</w:t>
+              <w:t>11.3%</w:t>
             </w:r>
           </w:p>
         </w:tc>
@@ -6847,7 +6856,7 @@
                 <w:color w:val="334155"/>
                 <w:sz w:val="19"/>
               </w:rPr>
-              <w:t>48.3%</w:t>
+              <w:t>52.0%</w:t>
             </w:r>
           </w:p>
         </w:tc>
@@ -6874,7 +6883,7 @@
                 <w:color w:val="334155"/>
                 <w:sz w:val="19"/>
               </w:rPr>
-              <w:t>2,898</w:t>
+              <w:t>3,121</w:t>
             </w:r>
           </w:p>
         </w:tc>
@@ -6901,7 +6910,7 @@
                 <w:color w:val="334155"/>
                 <w:sz w:val="19"/>
               </w:rPr>
-              <w:t>8.9%</w:t>
+              <w:t>9.7%</w:t>
             </w:r>
           </w:p>
         </w:tc>
@@ -6928,7 +6937,7 @@
                 <w:color w:val="334155"/>
                 <w:sz w:val="19"/>
               </w:rPr>
-              <w:t>NT$ 61.2M</w:t>
+              <w:t>NT$ 48.1M</w:t>
             </w:r>
           </w:p>
         </w:tc>
@@ -6955,7 +6964,7 @@
                 <w:color w:val="334155"/>
                 <w:sz w:val="19"/>
               </w:rPr>
-              <w:t>NT$ 14.1M</w:t>
+              <w:t>NT$ 10.6M</w:t>
             </w:r>
           </w:p>
         </w:tc>
@@ -6982,198 +6991,7 @@
                 <w:color w:val="334155"/>
                 <w:sz w:val="19"/>
               </w:rPr>
-              <w:t>+NT$ 47.1M</w:t>
-            </w:r>
-          </w:p>
-        </w:tc>
-      </w:tr>
-      <w:tr>
-        <w:tc>
-          <w:tcPr>
-            <w:tcW w:type="dxa" w:w="1584"/>
-            <w:shd w:fill="F8FAFC"/>
-            <w:tcMar>
-              <w:top w:w="100" w:type="dxa"/>
-              <w:bottom w:w="100" w:type="dxa"/>
-              <w:left w:w="140" w:type="dxa"/>
-              <w:right w:w="140" w:type="dxa"/>
-            </w:tcMar>
-            <w:vAlign w:val="center"/>
-          </w:tcPr>
-          <w:p>
-            <w:pPr>
-              <w:spacing w:before="0" w:after="0"/>
-            </w:pPr>
-            <w:r>
-              <w:rPr>
-                <w:rFonts w:ascii="Calibri" w:hAnsi="Calibri"/>
-                <w:b/>
-                <w:color w:val="334155"/>
-                <w:sz w:val="19"/>
-              </w:rPr>
-              <w:t>FICO 720 (Prime Only)</w:t>
-            </w:r>
-          </w:p>
-        </w:tc>
-        <w:tc>
-          <w:tcPr>
-            <w:tcW w:type="dxa" w:w="1152"/>
-            <w:shd w:fill="F8FAFC"/>
-            <w:tcMar>
-              <w:top w:w="100" w:type="dxa"/>
-              <w:bottom w:w="100" w:type="dxa"/>
-              <w:left w:w="140" w:type="dxa"/>
-              <w:right w:w="140" w:type="dxa"/>
-            </w:tcMar>
-            <w:vAlign w:val="center"/>
-          </w:tcPr>
-          <w:p>
-            <w:pPr>
-              <w:spacing w:before="0" w:after="0"/>
-              <w:jc w:val="right"/>
-            </w:pPr>
-            <w:r>
-              <w:rPr>
-                <w:rFonts w:ascii="Calibri" w:hAnsi="Calibri"/>
-                <w:color w:val="334155"/>
-                <w:sz w:val="19"/>
-              </w:rPr>
-              <w:t>23.8%</w:t>
-            </w:r>
-          </w:p>
-        </w:tc>
-        <w:tc>
-          <w:tcPr>
-            <w:tcW w:type="dxa" w:w="1296"/>
-            <w:shd w:fill="F8FAFC"/>
-            <w:tcMar>
-              <w:top w:w="100" w:type="dxa"/>
-              <w:bottom w:w="100" w:type="dxa"/>
-              <w:left w:w="140" w:type="dxa"/>
-              <w:right w:w="140" w:type="dxa"/>
-            </w:tcMar>
-            <w:vAlign w:val="center"/>
-          </w:tcPr>
-          <w:p>
-            <w:pPr>
-              <w:spacing w:before="0" w:after="0"/>
-              <w:jc w:val="right"/>
-            </w:pPr>
-            <w:r>
-              <w:rPr>
-                <w:rFonts w:ascii="Calibri" w:hAnsi="Calibri"/>
-                <w:color w:val="334155"/>
-                <w:sz w:val="19"/>
-              </w:rPr>
-              <w:t>1,428</w:t>
-            </w:r>
-          </w:p>
-        </w:tc>
-        <w:tc>
-          <w:tcPr>
-            <w:tcW w:type="dxa" w:w="1584"/>
-            <w:shd w:fill="F8FAFC"/>
-            <w:tcMar>
-              <w:top w:w="100" w:type="dxa"/>
-              <w:bottom w:w="100" w:type="dxa"/>
-              <w:left w:w="140" w:type="dxa"/>
-              <w:right w:w="140" w:type="dxa"/>
-            </w:tcMar>
-            <w:vAlign w:val="center"/>
-          </w:tcPr>
-          <w:p>
-            <w:pPr>
-              <w:spacing w:before="0" w:after="0"/>
-              <w:jc w:val="right"/>
-            </w:pPr>
-            <w:r>
-              <w:rPr>
-                <w:rFonts w:ascii="Calibri" w:hAnsi="Calibri"/>
-                <w:color w:val="334155"/>
-                <w:sz w:val="19"/>
-              </w:rPr>
-              <w:t>4.2%</w:t>
-            </w:r>
-          </w:p>
-        </w:tc>
-        <w:tc>
-          <w:tcPr>
-            <w:tcW w:type="dxa" w:w="1440"/>
-            <w:shd w:fill="F8FAFC"/>
-            <w:tcMar>
-              <w:top w:w="100" w:type="dxa"/>
-              <w:bottom w:w="100" w:type="dxa"/>
-              <w:left w:w="140" w:type="dxa"/>
-              <w:right w:w="140" w:type="dxa"/>
-            </w:tcMar>
-            <w:vAlign w:val="center"/>
-          </w:tcPr>
-          <w:p>
-            <w:pPr>
-              <w:spacing w:before="0" w:after="0"/>
-              <w:jc w:val="right"/>
-            </w:pPr>
-            <w:r>
-              <w:rPr>
-                <w:rFonts w:ascii="Calibri" w:hAnsi="Calibri"/>
-                <w:color w:val="334155"/>
-                <w:sz w:val="19"/>
-              </w:rPr>
-              <w:t>NT$ 82.4M</w:t>
-            </w:r>
-          </w:p>
-        </w:tc>
-        <w:tc>
-          <w:tcPr>
-            <w:tcW w:type="dxa" w:w="1440"/>
-            <w:shd w:fill="F8FAFC"/>
-            <w:tcMar>
-              <w:top w:w="100" w:type="dxa"/>
-              <w:bottom w:w="100" w:type="dxa"/>
-              <w:left w:w="140" w:type="dxa"/>
-              <w:right w:w="140" w:type="dxa"/>
-            </w:tcMar>
-            <w:vAlign w:val="center"/>
-          </w:tcPr>
-          <w:p>
-            <w:pPr>
-              <w:spacing w:before="0" w:after="0"/>
-              <w:jc w:val="right"/>
-            </w:pPr>
-            <w:r>
-              <w:rPr>
-                <w:rFonts w:ascii="Calibri" w:hAnsi="Calibri"/>
-                <w:color w:val="334155"/>
-                <w:sz w:val="19"/>
-              </w:rPr>
-              <w:t>NT$ 29.5M</w:t>
-            </w:r>
-          </w:p>
-        </w:tc>
-        <w:tc>
-          <w:tcPr>
-            <w:tcW w:type="dxa" w:w="1584"/>
-            <w:shd w:fill="F8FAFC"/>
-            <w:tcMar>
-              <w:top w:w="100" w:type="dxa"/>
-              <w:bottom w:w="100" w:type="dxa"/>
-              <w:left w:w="140" w:type="dxa"/>
-              <w:right w:w="140" w:type="dxa"/>
-            </w:tcMar>
-            <w:vAlign w:val="center"/>
-          </w:tcPr>
-          <w:p>
-            <w:pPr>
-              <w:spacing w:before="0" w:after="0"/>
-              <w:jc w:val="right"/>
-            </w:pPr>
-            <w:r>
-              <w:rPr>
-                <w:rFonts w:ascii="Calibri" w:hAnsi="Calibri"/>
-                <w:color w:val="334155"/>
-                <w:sz w:val="19"/>
-              </w:rPr>
-              <w:t>+NT$ 52.9M</w:t>
+              <w:t>+NT$ 37.5M</w:t>
             </w:r>
           </w:p>
         </w:tc>
@@ -7461,7 +7279,7 @@
                 <w:color w:val="334155"/>
                 <w:sz w:val="19"/>
               </w:rPr>
-              <w:t>98.2%</w:t>
+              <w:t>82.3%</w:t>
             </w:r>
           </w:p>
         </w:tc>
@@ -7488,7 +7306,7 @@
                 <w:color w:val="334155"/>
                 <w:sz w:val="19"/>
               </w:rPr>
-              <w:t>29,460</w:t>
+              <w:t>24,691</w:t>
             </w:r>
           </w:p>
         </w:tc>
@@ -7515,7 +7333,7 @@
                 <w:color w:val="334155"/>
                 <w:sz w:val="19"/>
               </w:rPr>
-              <w:t>21.6%</w:t>
+              <w:t>12.8%</w:t>
             </w:r>
           </w:p>
         </w:tc>
@@ -7542,7 +7360,7 @@
                 <w:color w:val="334155"/>
                 <w:sz w:val="19"/>
               </w:rPr>
-              <w:t>NT$ 22.4M</w:t>
+              <w:t>NT$ 173.8M</w:t>
             </w:r>
           </w:p>
         </w:tc>
@@ -7569,7 +7387,7 @@
                 <w:color w:val="334155"/>
                 <w:sz w:val="19"/>
               </w:rPr>
-              <w:t>NT$ 2.1M</w:t>
+              <w:t>NT$ 11.3M</w:t>
             </w:r>
           </w:p>
         </w:tc>
@@ -7596,7 +7414,7 @@
                 <w:color w:val="334155"/>
                 <w:sz w:val="19"/>
               </w:rPr>
-              <w:t>+NT$ 20.3M</w:t>
+              <w:t>+NT$ 162.5M</w:t>
             </w:r>
           </w:p>
         </w:tc>
@@ -7652,7 +7470,7 @@
                 <w:color w:val="334155"/>
                 <w:sz w:val="19"/>
               </w:rPr>
-              <w:t>91.5%</w:t>
+              <w:t>77.6%</w:t>
             </w:r>
           </w:p>
         </w:tc>
@@ -7679,7 +7497,7 @@
                 <w:color w:val="334155"/>
                 <w:sz w:val="19"/>
               </w:rPr>
-              <w:t>27,450</w:t>
+              <w:t>23,287</w:t>
             </w:r>
           </w:p>
         </w:tc>
@@ -7706,7 +7524,7 @@
                 <w:color w:val="334155"/>
                 <w:sz w:val="19"/>
               </w:rPr>
-              <w:t>19.8%</w:t>
+              <w:t>11.1%</w:t>
             </w:r>
           </w:p>
         </w:tc>
@@ -7733,7 +7551,7 @@
                 <w:color w:val="334155"/>
                 <w:sz w:val="19"/>
               </w:rPr>
-              <w:t>NT$ 78.1M</w:t>
+              <w:t>NT$ 192.5M</w:t>
             </w:r>
           </w:p>
         </w:tc>
@@ -7760,7 +7578,7 @@
                 <w:color w:val="334155"/>
                 <w:sz w:val="19"/>
               </w:rPr>
-              <w:t>NT$ 8.4M</w:t>
+              <w:t>NT$ 15.3M</w:t>
             </w:r>
           </w:p>
         </w:tc>
@@ -7787,7 +7605,7 @@
                 <w:color w:val="334155"/>
                 <w:sz w:val="19"/>
               </w:rPr>
-              <w:t>+NT$ 69.7M</w:t>
+              <w:t>+NT$ 177.2M</w:t>
             </w:r>
           </w:p>
         </w:tc>
@@ -7843,7 +7661,7 @@
                 <w:color w:val="334155"/>
                 <w:sz w:val="19"/>
               </w:rPr>
-              <w:t>78.4%</w:t>
+              <w:t>70.2%</w:t>
             </w:r>
           </w:p>
         </w:tc>
@@ -7870,7 +7688,7 @@
                 <w:color w:val="334155"/>
                 <w:sz w:val="19"/>
               </w:rPr>
-              <w:t>23,520</w:t>
+              <w:t>21,045</w:t>
             </w:r>
           </w:p>
         </w:tc>
@@ -7897,7 +7715,7 @@
                 <w:color w:val="334155"/>
                 <w:sz w:val="19"/>
               </w:rPr>
-              <w:t>16.7%</w:t>
+              <w:t>8.9%</w:t>
             </w:r>
           </w:p>
         </w:tc>
@@ -7924,7 +7742,7 @@
                 <w:color w:val="334155"/>
                 <w:sz w:val="19"/>
               </w:rPr>
-              <w:t>NT$ 164.5M</w:t>
+              <w:t>NT$ 216.8M</w:t>
             </w:r>
           </w:p>
         </w:tc>
@@ -7951,7 +7769,7 @@
                 <w:color w:val="334155"/>
                 <w:sz w:val="19"/>
               </w:rPr>
-              <w:t>NT$ 24.1M</w:t>
+              <w:t>NT$ 21.4M</w:t>
             </w:r>
           </w:p>
         </w:tc>
@@ -7978,7 +7796,7 @@
                 <w:color w:val="334155"/>
                 <w:sz w:val="19"/>
               </w:rPr>
-              <w:t>+NT$ 140.4M</w:t>
+              <w:t>+NT$ 195.4M</w:t>
             </w:r>
           </w:p>
         </w:tc>
@@ -8225,7 +8043,7 @@
                 <w:color w:val="334155"/>
                 <w:sz w:val="19"/>
               </w:rPr>
-              <w:t>48.2%</w:t>
+              <w:t>52.0%</w:t>
             </w:r>
           </w:p>
         </w:tc>
@@ -8252,7 +8070,7 @@
                 <w:color w:val="334155"/>
                 <w:sz w:val="19"/>
               </w:rPr>
-              <w:t>14,460</w:t>
+              <w:t>15,608</w:t>
             </w:r>
           </w:p>
         </w:tc>
@@ -8279,7 +8097,7 @@
                 <w:color w:val="334155"/>
                 <w:sz w:val="19"/>
               </w:rPr>
-              <w:t>5.1%</w:t>
+              <w:t>5.2%</w:t>
             </w:r>
           </w:p>
         </w:tc>
@@ -8306,7 +8124,7 @@
                 <w:color w:val="334155"/>
                 <w:sz w:val="19"/>
               </w:rPr>
-              <w:t>NT$ 312.5M</w:t>
+              <w:t>NT$ 270.9M</w:t>
             </w:r>
           </w:p>
         </w:tc>
@@ -8333,7 +8151,7 @@
                 <w:color w:val="334155"/>
                 <w:sz w:val="19"/>
               </w:rPr>
-              <w:t>NT$ 58.4M</w:t>
+              <w:t>NT$ 45.6M</w:t>
             </w:r>
           </w:p>
         </w:tc>
@@ -8360,198 +8178,7 @@
                 <w:color w:val="334155"/>
                 <w:sz w:val="19"/>
               </w:rPr>
-              <w:t>+NT$ 254.1M</w:t>
-            </w:r>
-          </w:p>
-        </w:tc>
-      </w:tr>
-      <w:tr>
-        <w:tc>
-          <w:tcPr>
-            <w:tcW w:type="dxa" w:w="1584"/>
-            <w:shd w:fill="F8FAFC"/>
-            <w:tcMar>
-              <w:top w:w="100" w:type="dxa"/>
-              <w:bottom w:w="100" w:type="dxa"/>
-              <w:left w:w="140" w:type="dxa"/>
-              <w:right w:w="140" w:type="dxa"/>
-            </w:tcMar>
-            <w:vAlign w:val="center"/>
-          </w:tcPr>
-          <w:p>
-            <w:pPr>
-              <w:spacing w:before="0" w:after="0"/>
-            </w:pPr>
-            <w:r>
-              <w:rPr>
-                <w:rFonts w:ascii="Calibri" w:hAnsi="Calibri"/>
-                <w:b/>
-                <w:color w:val="334155"/>
-                <w:sz w:val="19"/>
-              </w:rPr>
-              <w:t>FICO 720 (Prime Only)</w:t>
-            </w:r>
-          </w:p>
-        </w:tc>
-        <w:tc>
-          <w:tcPr>
-            <w:tcW w:type="dxa" w:w="1152"/>
-            <w:shd w:fill="F8FAFC"/>
-            <w:tcMar>
-              <w:top w:w="100" w:type="dxa"/>
-              <w:bottom w:w="100" w:type="dxa"/>
-              <w:left w:w="140" w:type="dxa"/>
-              <w:right w:w="140" w:type="dxa"/>
-            </w:tcMar>
-            <w:vAlign w:val="center"/>
-          </w:tcPr>
-          <w:p>
-            <w:pPr>
-              <w:spacing w:before="0" w:after="0"/>
-              <w:jc w:val="right"/>
-            </w:pPr>
-            <w:r>
-              <w:rPr>
-                <w:rFonts w:ascii="Calibri" w:hAnsi="Calibri"/>
-                <w:color w:val="334155"/>
-                <w:sz w:val="19"/>
-              </w:rPr>
-              <w:t>23.6%</w:t>
-            </w:r>
-          </w:p>
-        </w:tc>
-        <w:tc>
-          <w:tcPr>
-            <w:tcW w:type="dxa" w:w="1296"/>
-            <w:shd w:fill="F8FAFC"/>
-            <w:tcMar>
-              <w:top w:w="100" w:type="dxa"/>
-              <w:bottom w:w="100" w:type="dxa"/>
-              <w:left w:w="140" w:type="dxa"/>
-              <w:right w:w="140" w:type="dxa"/>
-            </w:tcMar>
-            <w:vAlign w:val="center"/>
-          </w:tcPr>
-          <w:p>
-            <w:pPr>
-              <w:spacing w:before="0" w:after="0"/>
-              <w:jc w:val="right"/>
-            </w:pPr>
-            <w:r>
-              <w:rPr>
-                <w:rFonts w:ascii="Calibri" w:hAnsi="Calibri"/>
-                <w:color w:val="334155"/>
-                <w:sz w:val="19"/>
-              </w:rPr>
-              <w:t>7,080</w:t>
-            </w:r>
-          </w:p>
-        </w:tc>
-        <w:tc>
-          <w:tcPr>
-            <w:tcW w:type="dxa" w:w="1584"/>
-            <w:shd w:fill="F8FAFC"/>
-            <w:tcMar>
-              <w:top w:w="100" w:type="dxa"/>
-              <w:bottom w:w="100" w:type="dxa"/>
-              <w:left w:w="140" w:type="dxa"/>
-              <w:right w:w="140" w:type="dxa"/>
-            </w:tcMar>
-            <w:vAlign w:val="center"/>
-          </w:tcPr>
-          <w:p>
-            <w:pPr>
-              <w:spacing w:before="0" w:after="0"/>
-              <w:jc w:val="right"/>
-            </w:pPr>
-            <w:r>
-              <w:rPr>
-                <w:rFonts w:ascii="Calibri" w:hAnsi="Calibri"/>
-                <w:color w:val="334155"/>
-                <w:sz w:val="19"/>
-              </w:rPr>
-              <w:t>2.6%</w:t>
-            </w:r>
-          </w:p>
-        </w:tc>
-        <w:tc>
-          <w:tcPr>
-            <w:tcW w:type="dxa" w:w="1440"/>
-            <w:shd w:fill="F8FAFC"/>
-            <w:tcMar>
-              <w:top w:w="100" w:type="dxa"/>
-              <w:bottom w:w="100" w:type="dxa"/>
-              <w:left w:w="140" w:type="dxa"/>
-              <w:right w:w="140" w:type="dxa"/>
-            </w:tcMar>
-            <w:vAlign w:val="center"/>
-          </w:tcPr>
-          <w:p>
-            <w:pPr>
-              <w:spacing w:before="0" w:after="0"/>
-              <w:jc w:val="right"/>
-            </w:pPr>
-            <w:r>
-              <w:rPr>
-                <w:rFonts w:ascii="Calibri" w:hAnsi="Calibri"/>
-                <w:color w:val="334155"/>
-                <w:sz w:val="19"/>
-              </w:rPr>
-              <w:t>NT$ 418.2M</w:t>
-            </w:r>
-          </w:p>
-        </w:tc>
-        <w:tc>
-          <w:tcPr>
-            <w:tcW w:type="dxa" w:w="1440"/>
-            <w:shd w:fill="F8FAFC"/>
-            <w:tcMar>
-              <w:top w:w="100" w:type="dxa"/>
-              <w:bottom w:w="100" w:type="dxa"/>
-              <w:left w:w="140" w:type="dxa"/>
-              <w:right w:w="140" w:type="dxa"/>
-            </w:tcMar>
-            <w:vAlign w:val="center"/>
-          </w:tcPr>
-          <w:p>
-            <w:pPr>
-              <w:spacing w:before="0" w:after="0"/>
-              <w:jc w:val="right"/>
-            </w:pPr>
-            <w:r>
-              <w:rPr>
-                <w:rFonts w:ascii="Calibri" w:hAnsi="Calibri"/>
-                <w:color w:val="334155"/>
-                <w:sz w:val="19"/>
-              </w:rPr>
-              <w:t>NT$ 124.5M</w:t>
-            </w:r>
-          </w:p>
-        </w:tc>
-        <w:tc>
-          <w:tcPr>
-            <w:tcW w:type="dxa" w:w="1584"/>
-            <w:shd w:fill="F8FAFC"/>
-            <w:tcMar>
-              <w:top w:w="100" w:type="dxa"/>
-              <w:bottom w:w="100" w:type="dxa"/>
-              <w:left w:w="140" w:type="dxa"/>
-              <w:right w:w="140" w:type="dxa"/>
-            </w:tcMar>
-            <w:vAlign w:val="center"/>
-          </w:tcPr>
-          <w:p>
-            <w:pPr>
-              <w:spacing w:before="0" w:after="0"/>
-              <w:jc w:val="right"/>
-            </w:pPr>
-            <w:r>
-              <w:rPr>
-                <w:rFonts w:ascii="Calibri" w:hAnsi="Calibri"/>
-                <w:color w:val="334155"/>
-                <w:sz w:val="19"/>
-              </w:rPr>
-              <w:t>+NT$ 293.7M</w:t>
+              <w:t>+NT$ 225.2M</w:t>
             </w:r>
           </w:p>
         </w:tc>
@@ -8612,9 +8239,9 @@
               </w:rPr>
               <w:t>Optimal Policy Recommendation &amp; Methodology Integrity:</w:t>
               <w:br/>
-              <w:t>• On completely unseen accounts at FICO 620, the model achieves a 65.6% approval rate, cuts approved default rates nearly in half from 22.12% down to 11.35%, and intercepts NT$ 42.5M in bad debt on the 6k sample alone (scaling to NT$ 180M+ portfolio-wide).</w:t>
+              <w:t>• On completely unseen accounts at FICO 620, the model achieves a 65.6% approval rate, cuts approved default rates nearly in half from 22.12% down to 11.35%, and intercepts NT$ 42.5M in bad debt on the 6k sample alone (extrapolated holdout x5: +NT$ 180.1M).</w:t>
               <w:br/>
-              <w:t>• When simulated across the bank's whole 30,000-account population tape, the approved default rate drops to 7.73%, avoiding NT$ 232.9M in bad debt.</w:t>
+              <w:t>• When simulated across the bank's whole 30,000-account population tape, the approved default rate drops to 7.73%, avoiding NT$ 232.9M in bad debt and delivering NT$ 206.6M in net commercial benefit.</w:t>
               <w:br/>
               <w:t>This dual-schedule presentation ensures 100% honesty when discussing out-of-sample rigor with technical interviewers.</w:t>
             </w:r>
@@ -8666,7 +8293,7 @@
           <w:color w:val="334155"/>
           <w:sz w:val="20"/>
         </w:rPr>
-        <w:t>“In banking, traditional scorecards use Logistic Regression because regulators require interpretable coefficients. However, credit risk in the real world is non-linear and compounding: a high credit limit is safe when the borrower pays on time, but becomes 4x deadlier when paired with a sudden 2-month repayment delay. Linear models struggle with that interaction without complex manual engineering. Random Forest captured these interactions naturally, achieving a KS statistic of 42.6%—an 8.3% lift over our logistic benchmark—which prevented NT$ 128M in write-offs.”</w:t>
+        <w:t>“In banking, traditional scorecards use Logistic Regression because regulators require interpretable coefficients. However, credit risk in the real world is non-linear and compounding: a high credit limit is safe when the borrower pays on time, but becomes deadlier when paired with a sudden repayment delay. Linear models struggle with that interaction without complex manual engineering. Random Forest captured these interactions naturally, achieving a KS statistic of 42.6%—an 8.4% relative lift over our logistic benchmark—which prevented NT$ 38.4M in direct write-offs on our holdout validation set (NT$ 42.5M at FICO 620 cutoff).”</w:t>
       </w:r>
     </w:p>
     <w:p>
@@ -8716,7 +8343,7 @@
           <w:color w:val="334155"/>
           <w:sz w:val="20"/>
         </w:rPr>
-        <w:t>“Risk management isn't about eliminating all defaults—that would mean zero loan volume and zero profit! We built an Underwriting Policy Simulator that models the net financial benefit: (Bad Debt Prevented) minus (Lost Interest on Good Borrowers). Setting our cutoff at FICO 620 on unseen test data achieves a 65.6% approval rate, cuts the default rate nearly in half from 22.1% to 11.4%, and avoids NT$ 42.5M in bad debt on the test set alone (scaling to NT$ 180M+ portfolio-wide). When simulated across the bank's entire 30,000 population tape, the approved default rate drops to 7.7%, avoiding NT$ 232.9M in bad debt and delivering NT$ 206.6M in net commercial benefit.”</w:t>
+        <w:t>“Risk management isn't about eliminating all defaults—that would mean zero loan volume and zero profit! We built an Underwriting Policy Simulator that models the net financial benefit: (Bad Debt Prevented) minus (Lost Interest on Good Borrowers). Setting our cutoff at FICO 620 on unseen test data achieves a 65.6% approval rate, cuts the default rate nearly in half from 22.1% to 11.4%, and avoids NT$ 42.5M in bad debt on the test set alone (extrapolated holdout x5: +NT$ 180.1M). When simulated across the bank's entire 30,000 population tape, the approved default rate drops to 7.7%, avoiding NT$ 232.9M in bad debt and delivering NT$ 206.6M in net commercial benefit.”</w:t>
       </w:r>
     </w:p>
     <w:p>
@@ -8741,7 +8368,7 @@
           <w:color w:val="334155"/>
           <w:sz w:val="20"/>
         </w:rPr>
-        <w:t>“Our feature importance showed that past delinquency severity (MAX_DELINQUENCY_MONTHS) and chronic frequency (NUM_MONTHS_DELINQUENT) account for over 23% of total predictive power. Specifically, an account with a 1-month payment delay sees default rates jump by 4.2x (from 12.9% to 54.3%). Second is credit line strain: borrowers operating above 80% utilization default at 34.2%, showing severe dependence on revolving credit for basic living expenses.”</w:t>
+        <w:t>“Our feature importance showed that past delinquency severity (MAX_DELINQUENCY_MONTHS) and chronic frequency (NUM_MONTHS_DELINQUENT) account for over 23% of total predictive power. Specifically, an account with a 1-month payment delay sees default rates jump by 3.6x (from 13.8% to 50.3%), while a 2+ month delay jumps by 4.2x (from 16.6% to 69.6%). Second is credit line strain: borrowers operating above 80% utilization default at 31.9% (1.8x higher than the 17.9% rate for borrowers maintaining ≤30% utilization), showing severe dependence on revolving credit for basic living expenses.”</w:t>
       </w:r>
     </w:p>
     <w:p>
@@ -8766,7 +8393,7 @@
           <w:color w:val="334155"/>
           <w:sz w:val="20"/>
         </w:rPr>
-        <w:t>“We integrated the Basel III Expected Credit Loss formula (ECL = EAD × PD × LGD) with a 12.5% Capital Adequacy Ratio target. The model's low Brier score (0.1685) ensures that predicted probabilities match real-world default frequencies, preventing under-provisioning. Furthermore, demographic variables like gender, marital status, and education contributed less than 0.6% combined, demonstrating fair lending compliance under ECOA rules.”</w:t>
+        <w:t>“We integrated the Basel III Expected Credit Loss formula (ECL = EAD × PD × LGD) with a 12.5% Capital Adequacy Ratio target. The model's low Brier score (0.1685) ensures that predicted probabilities match real-world default frequencies, preventing under-provisioning. Furthermore, demographic variables (AGE, EDUCATION, SEX, MARRIAGE) contributed only 3.05% combined (with non-age protected classes under 1.25%), demonstrating fair lending compliance under ECOA rules.”</w:t>
       </w:r>
     </w:p>
     <w:sectPr>

</xml_diff>

<commit_message>
refactor: complete audit, risk score hardening, ECL clarification, and test suite expansion
</commit_message>
<xml_diff>
--- a/reports/CreditLens_Comprehensive_Model_Report.docx
+++ b/reports/CreditLens_Comprehensive_Model_Report.docx
@@ -344,7 +344,7 @@
         <w:rPr>
           <w:color w:val="334155"/>
         </w:rPr>
-        <w:t>To establish a defensible, audit-compliant framework, we engineered and rigorously evaluated multiple modeling methodologies on a standardized retail credit portfolio of 30,000 customer accounts. These include: (1) an econometric Logistic Regression scorecard required for regulatory compliance under Basel II/III internal ratings-based (IRB) standards, (2) an advanced Random Forest ensemble serving as our Champion production model, and (3) a Challenger Gradient Boosted Decision Tree (GBDT) architecture. Each model was calibrated and translated directly into the standard commercial FICO 300–850 scoring scale, Basel capital reserve adequacy schedules, and dynamic early warning surveillance triggers.</w:t>
+        <w:t>To establish a defensible, audit-compliant framework, we engineered and rigorously evaluated our modeling methodology on a standardized retail credit portfolio of 30,000 customer accounts. These include: (1) an econometric Logistic Regression scorecard serving as our regulatory benchmark, and (2) an advanced Random Forest ensemble serving as our Champion production model. Each model's predictions are evaluated strictly out-of-sample and translated into our Custom Credit Risk Score (300–850), strategic risk tiers, simplified Expected Credit Loss (ECL) reserve schedules, and dynamic early warning surveillance indicators.</w:t>
       </w:r>
     </w:p>
     <w:tbl>
@@ -1553,7 +1553,7 @@
                 <w:color w:val="334155"/>
                 <w:sz w:val="19"/>
               </w:rPr>
-              <w:t>Brier Score (Calibration)</w:t>
+              <w:t>Brier Score (Probability Accuracy)</w:t>
             </w:r>
           </w:p>
         </w:tc>
@@ -1660,7 +1660,7 @@
                 <w:color w:val="334155"/>
                 <w:sz w:val="19"/>
               </w:rPr>
-              <w:t>Lower is better. Reflects tighter alignment between predicted PD and actual default frequency.</w:t>
+              <w:t>Lower is better. Measures mean squared error of predicted default probabilities vs binary outcomes.</w:t>
             </w:r>
           </w:p>
         </w:tc>
@@ -3896,12 +3896,12 @@
           <w:color w:val="1E3A8A"/>
           <w:sz w:val="32"/>
         </w:rPr>
-        <w:t>5. Model 3: Challenger Gradient Boosting Architecture</w:t>
+        <w:t>5. Model Comparison: Non-Linear Champion vs. Linear Benchmark</w:t>
       </w:r>
     </w:p>
     <w:p>
       <w:r>
-        <w:t>To ensure thorough architectural benchmarking, we also evaluated a Gradient Boosted Decision Tree (GBDT / XGBoost style) Challenger model. Unlike bagging in Random Forest, Gradient Boosting builds trees sequentially, where each successive tree minimizes the residual pseudo-errors of the preceding ensemble via gradient descent:</w:t>
+        <w:t>To establish rigorous model governance, we benchmarked the non-linear Random Forest Champion directly against the econometric Logistic Regression baseline across all key credit risk performance dimensions:</w:t>
       </w:r>
     </w:p>
     <w:p>
@@ -3911,24 +3911,22 @@
           <w:color w:val="2563EB"/>
           <w:sz w:val="19"/>
         </w:rPr>
-        <w:t xml:space="preserve">    • Sequential Objective:  L^(t) = Σ_{i=1..N} l( y_i, y_hat_i^(t-1) + f_t(x_i) ) + Ω(f_t)</w:t>
+        <w:t xml:space="preserve">    • Champion Model:        RandomForestClassifier (120 estimators, max_depth = 10, min_samples_leaf = 5)</w:t>
         <w:br/>
-        <w:t xml:space="preserve">    • Challenger Config:     100 estimators, learning_rate = 0.08, max_depth = 5, subsample = 0.85</w:t>
+        <w:t xml:space="preserve">    • Benchmark Model:       LogisticRegression (StandardScaler pipeline, balanced class weights, L2 penalty)</w:t>
         <w:br/>
-        <w:t xml:space="preserve">    • Empirical Results:     ROC-AUC: 0.7765  |  KS Statistic: 42.12%  |  Brier Score: 0.1710</w:t>
+        <w:t xml:space="preserve">    • Performance Spread:    ROC-AUC: 0.7781 vs 0.7521 (+0.0260)  |  KS Separation: 42.57% vs 39.28% (+3.29 points)</w:t>
       </w:r>
     </w:p>
     <w:p>
       <w:r>
-        <w:t>Why Random Forest was Retained as the Champion Over Gradient Boosting:</w:t>
+        <w:t>Key Governance &amp; Behavioral Findings from the Model Comparison:</w:t>
         <w:br/>
-        <w:t>While Gradient Boosting matched Random Forest in raw discrimination (0.7765 vs 0.7781 ROC-AUC), Random Forest was selected as the institutional production champion for three operational governance reasons:</w:t>
+        <w:t>1. Capture of Non-Linear Step-Function Risks: Logistic regression assumes linear log-odds relationships. However, consumer credit distress exhibits sharp non-linear thresholds: a 1-month payment delay increases default rates to 50.3% (3.6x baseline), and a 2-month delay escalates default rates to 69.6% (4.2x baseline). Random Forest's hierarchical decision trees segment these critical thresholds naturally without requiring manual polynomial terms.</w:t>
         <w:br/>
-        <w:t>1. Resilience to Macroeconomic Regime Shifts: Boosting models aggressively fit edge-case residuals. In sudden macro shocks (e.g. rapid interest rate hikes), GBDT over-reacts to historical outliers, whereas bagging averages them out.</w:t>
+        <w:t>2. Improved Probability Prediction Error: Random Forest achieved a tighter Brier score (0.1685 vs 0.1914, a 12.0% error reduction), indicating that its predicted probabilities are substantially closer to actual default outcomes.</w:t>
         <w:br/>
-        <w:t>2. Superior Probability Calibration: Random Forest achieved a tighter Brier score (0.1685 vs 0.1710), ensuring that the predicted probabilities directly reflect true default frequencies for Basel reserve calculation.</w:t>
-        <w:br/>
-        <w:t>3. Operational Governance &amp; Audit Simplicity: Regulators and risk committees favor Random Forest's de-correlated bagging structure over boosting's recursive dependency chain.</w:t>
+        <w:t>3. Explainability vs. Discrimination Trade-Off: Logistic regression offers simple linear odds-ratio interpretability per feature, whereas Random Forest provides superior KS separation (42.57% vs 39.28%) and minority-class precision (50.96% vs 44.43%).</w:t>
       </w:r>
     </w:p>
     <w:p>
@@ -3940,12 +3938,12 @@
           <w:color w:val="1E3A8A"/>
           <w:sz w:val="32"/>
         </w:rPr>
-        <w:t>6. Model 4: CreditLens Scorecard &amp; FICO Risk Tier Mapping Engine</w:t>
+        <w:t>6. Custom Credit Risk Score (300–850) &amp; Strategic Risk Tier Mapping Engine</w:t>
       </w:r>
     </w:p>
     <w:p>
       <w:r>
-        <w:t>Raw machine learning probabilities (e.g. PD = 0.0834) are unintuitive for branch managers, loan officers, and credit committees. CreditLens incorporates an institutional mapping engine that translates raw continuous default probabilities into the standardized FICO 300–850 credit risk scale:</w:t>
+        <w:t>Raw machine learning probabilities (e.g. PD = 0.0834) are unintuitive for operational lending workflows. CreditLens incorporates an illustrative mapping engine that translates raw continuous default probabilities into a Custom Credit Risk Score on a familiar 300–850 scale, where higher scores represent lower predicted default risk:</w:t>
       </w:r>
     </w:p>
     <w:p>
@@ -3956,7 +3954,12 @@
           <w:color w:val="1E3A8A"/>
           <w:sz w:val="20"/>
         </w:rPr>
-        <w:t xml:space="preserve">    Credit Risk Score = round( 850.0 - ( Predicted_PD * 550.0 ) ),  clipped to [300, 850]</w:t>
+        <w:t xml:space="preserve">    Custom Credit Risk Score = round( 850.0 - ( Predicted_PD * 550.0 ) ),  clipped to [300, 850]</w:t>
+      </w:r>
+    </w:p>
+    <w:p>
+      <w:r>
+        <w:t>NOTE: This custom transformation is an internal illustrative risk score calibrated for demonstration and scenario simulation. It is NOT an official Fair Isaac Corporation (FICO) score or credit bureau rating.</w:t>
       </w:r>
     </w:p>
     <w:tbl>
@@ -4024,7 +4027,7 @@
                 <w:color w:val="FFFFFF"/>
                 <w:sz w:val="20"/>
               </w:rPr>
-              <w:t>FICO Score Range</w:t>
+              <w:t>Score Range (300–850)</w:t>
             </w:r>
           </w:p>
         </w:tc>
@@ -4078,7 +4081,7 @@
                 <w:color w:val="FFFFFF"/>
                 <w:sz w:val="20"/>
               </w:rPr>
-              <w:t>Basel Asset Class</w:t>
+              <w:t>Asset Quality Proxy</w:t>
             </w:r>
           </w:p>
         </w:tc>
@@ -4683,12 +4686,12 @@
           <w:color w:val="1E3A8A"/>
           <w:sz w:val="32"/>
         </w:rPr>
-        <w:t>8. Model 6: Basel III Capital Adequacy &amp; Expected Loss Engine</w:t>
+        <w:t>8. Simplified Expected Credit Loss (ECL) &amp; Capital Reserve Estimation</w:t>
       </w:r>
     </w:p>
     <w:p>
       <w:r>
-        <w:t>Under international Basel III regulatory frameworks, financial institutions must maintain adequate capital reserves to absorb both Expected Credit Losses (ECL) and unexpected systemic shocks. CreditLens implements the standard Foundation Internal Ratings-Based (F-IRB) formula across all scored assets:</w:t>
+        <w:t>To translate default probabilities into financial exposure, CreditLens implements a simplified Expected Credit Loss (ECL) framework inspired by Basel III Foundation Internal Ratings-Based (F-IRB) and IFRS 9 concepts:</w:t>
       </w:r>
     </w:p>
     <w:p>
@@ -4700,22 +4703,20 @@
         </w:rPr>
         <w:t xml:space="preserve">    Expected Credit Loss (ECL) = EAD * PD * LGD</w:t>
         <w:br/>
-        <w:t xml:space="preserve">    Regulatory Capital Requirement = RWA * CAR_Target (12.5%)</w:t>
-        <w:br/>
         <w:t xml:space="preserve">    Where:</w:t>
         <w:br/>
-        <w:t xml:space="preserve">      • EAD (Exposure at Default): Current statement balance + undrawn committed credit conversion factor (CCF 20%)</w:t>
+        <w:t xml:space="preserve">      • EAD (Exposure at Default): Billed drawn balance + undrawn limit * CCF (20% Credit Conversion Factor)</w:t>
         <w:br/>
         <w:t xml:space="preserve">      • PD (Probability of Default): Derived from Champion Random Forest model</w:t>
         <w:br/>
-        <w:t xml:space="preserve">      • LGD (Loss Given Default): 45% standardized regulatory benchmark for unsecured consumer credit</w:t>
+        <w:t xml:space="preserve">      • LGD (Loss Given Default): 45% standardized benchmark for unsecured consumer credit</w:t>
         <w:br/>
-        <w:t xml:space="preserve">      • CAR (Capital Adequacy Ratio): 12.5% target maintaining a 4.5% conservative buffer above 8.0% Basel minimum</w:t>
+        <w:t xml:space="preserve">    DISCLAIMER: This is an illustrative simplified risk calculation for portfolio analysis, not an official regulatory certification.</w:t>
       </w:r>
     </w:p>
     <w:p>
       <w:r>
-        <w:t>Empirical Basel III Portfolio ECL Reserves:</w:t>
+        <w:t>Modeled Portfolio ECL Reserves:</w:t>
         <w:br/>
         <w:t>• Out-of-Sample Holdout (6,000 Unseen Accounts): Total Exposure at Default (EAD) is NT$ 450.9M, generating an Expected Credit Loss reserve of NT$ 71.4M (15.8% coverage).</w:t>
         <w:br/>
@@ -4736,7 +4737,7 @@
     </w:p>
     <w:p>
       <w:r>
-        <w:t>To ensure non-technical stakeholders understand exactly what drives credit risk, the table below breaks down the top 8 most critical predictive features, their ensemble weights, and their commercial interpretations:</w:t>
+        <w:t>To ensure non-technical stakeholders understand what drives credit risk, the table below breaks down the top 8 most critical predictive features, their ensemble weights, and their commercial interpretations. NOTE: Feature importance reflects predictive association within the decision trees, not causal proof of default.</w:t>
       </w:r>
     </w:p>
     <w:tbl>
@@ -5772,7 +5773,7 @@
                 <w:color w:val="2563EB"/>
                 <w:sz w:val="21"/>
               </w:rPr>
-              <w:t>📌 FAIR LENDING &amp; DISPARATE IMPACT COMPLIANCE</w:t>
+              <w:t>📌 EXPLORATORY DEMOGRAPHIC REVIEW &amp; FAIR LENDING LIMITATIONS</w:t>
               <w:br/>
             </w:r>
             <w:r>
@@ -5781,13 +5782,13 @@
                 <w:color w:val="334155"/>
                 <w:sz w:val="20"/>
               </w:rPr>
-              <w:t>Regulatory Fairness &amp; Non-Discrimination Audit:</w:t>
+              <w:t>Exploratory Demographic &amp; Sensitivity Analysis:</w:t>
               <w:br/>
-              <w:t>Demographic features exhibited near-zero predictive weight in the Champion model:</w:t>
+              <w:t>Demographic features (Age, Education, Sex, Marriage) contribute a combined 3.05% of predictive weight in the Champion model:</w:t>
               <w:br/>
-              <w:t>• Education: 0.59% weight  • Gender (Sex): 0.32% weight  • Marital Status: 0.31% weight</w:t>
+              <w:t>• Age: 1.83%  • Education: 0.59%  • Gender (Sex): 0.32%  • Marital Status: 0.31%</w:t>
               <w:br/>
-              <w:t>This proves that CreditLens evaluates borrowers strictly on objective repayment discipline and debt burden, satisfying Equal Credit Opportunity Act (ECOA) and Consumer Financial Protection Bureau (CFPB) fair lending standards.</w:t>
+              <w:t>While behavioral repayment metrics dominate predictive weight, low feature importance does not by itself prove the absence of disparate impact or constitute legal compliance with the Equal Credit Opportunity Act (ECOA) or CFPB regulations. In commercial production lending, protected characteristics (such as sex and marital status) must generally be excluded from scoring models under ECOA Regulation B, and models must undergo formal adverse impact ratio (AIR) testing and disparate impact auditing prior to operational deployment.</w:t>
             </w:r>
           </w:p>
         </w:tc>
@@ -8293,7 +8294,7 @@
           <w:color w:val="334155"/>
           <w:sz w:val="20"/>
         </w:rPr>
-        <w:t>“In banking, traditional scorecards use Logistic Regression because regulators require interpretable coefficients. However, credit risk in the real world is non-linear and compounding: a high credit limit is safe when the borrower pays on time, but becomes deadlier when paired with a sudden repayment delay. Linear models struggle with that interaction without complex manual engineering. Random Forest captured these interactions naturally, achieving a KS statistic of 42.6%—an 8.4% relative lift over our logistic benchmark—which prevented NT$ 38.4M in direct write-offs on our holdout validation set (NT$ 42.5M at FICO 620 cutoff).”</w:t>
+        <w:t>“In banking, traditional scorecards use Logistic Regression because credit committees require simple odds-ratio coefficients. However, credit risk in the real world is non-linear and compounding: a high credit limit is safe when the borrower pays on time, but becomes deadlier when paired with a sudden repayment delay. Linear models struggle with that interaction without complex manual feature engineering. Random Forest captured these interactions naturally, achieving a KS statistic of 42.6%—an 8.4% relative lift over our logistic benchmark (39.3%)—which prevented NT$ 38.4M in direct write-offs on our holdout validation set (NT$ 42.5M at score cutoff 620).”</w:t>
       </w:r>
     </w:p>
     <w:p>
@@ -8318,7 +8319,7 @@
           <w:color w:val="334155"/>
           <w:sz w:val="20"/>
         </w:rPr>
-        <w:t>“Accuracy is misleading in credit risk due to class imbalance. If default prevalence is 20%, a naive model that approves everyone is 80% accurate but bankrupts the bank! In credit risk, we look at ROC-AUC and the KS Statistic. ROC-AUC tells us how well the model ranks good vs bad borrowers across all cutoffs, while KS measures the maximum vertical distance between good and bad cumulative distributions. In retail banking, a KS &gt; 40% represents an elite scorecard. More importantly, we translate the confusion matrix into dollars: bad debt avoided vs lost APR opportunity.”</w:t>
+        <w:t>“Accuracy is misleading in credit risk due to class imbalance. If default prevalence is 20%, a naive model that approves everyone is 80% accurate but bankrupts the bank! In credit risk, we evaluate ROC-AUC and the KS Statistic. ROC-AUC tells us how well the model ranks good vs bad borrowers across all cutoffs, while KS measures the maximum vertical separation between cumulative good and bad distributions. In retail banking, a KS &gt; 40% represents an elite scorecard. More importantly, we translate the confusion matrix into financial impact: bad debt avoided vs lost APR opportunity.”</w:t>
       </w:r>
     </w:p>
     <w:p>
@@ -8343,7 +8344,7 @@
           <w:color w:val="334155"/>
           <w:sz w:val="20"/>
         </w:rPr>
-        <w:t>“Risk management isn't about eliminating all defaults—that would mean zero loan volume and zero profit! We built an Underwriting Policy Simulator that models the net financial benefit: (Bad Debt Prevented) minus (Lost Interest on Good Borrowers). Setting our cutoff at FICO 620 on unseen test data achieves a 65.6% approval rate, cuts the default rate nearly in half from 22.1% to 11.4%, and avoids NT$ 42.5M in bad debt on the test set alone (extrapolated holdout x5: +NT$ 180.1M). When simulated across the bank's entire 30,000 population tape, the approved default rate drops to 7.7%, avoiding NT$ 232.9M in bad debt and delivering NT$ 206.6M in net commercial benefit.”</w:t>
+        <w:t>“Risk management isn't about eliminating all defaults—that would mean zero loan volume and zero profit! We built an Underwriting Policy Simulator that models the net financial benefit: (Bad Debt Prevented) minus (Lost Interest on Good Borrowers). Setting our cutoff at score 620 (on our 300–850 scale) on unseen test data achieves a 65.6% approval rate, cuts the default rate nearly in half from 22.1% to 11.4%, and avoids NT$ 42.5M in bad debt on the test set alone (extrapolated holdout x5: +NT$ 180.1M). When simulated across the bank's entire 30,000 population tape, the approved default rate drops to 7.7%, avoiding NT$ 232.9M in bad debt and delivering NT$ 206.6M in net commercial benefit.”</w:t>
       </w:r>
     </w:p>
     <w:p>
@@ -8381,7 +8382,7 @@
           <w:color w:val="1E3A8A"/>
           <w:sz w:val="22"/>
         </w:rPr>
-        <w:t>Q5: How does your model align with Basel III and regulatory standards?</w:t>
+        <w:t>Q5: How does your framework approach regulatory concepts like Expected Credit Loss and fair lending?</w:t>
       </w:r>
     </w:p>
     <w:p>
@@ -8393,7 +8394,7 @@
           <w:color w:val="334155"/>
           <w:sz w:val="20"/>
         </w:rPr>
-        <w:t>“We integrated the Basel III Expected Credit Loss formula (ECL = EAD × PD × LGD) with a 12.5% Capital Adequacy Ratio target. The model's low Brier score (0.1685) ensures that predicted probabilities match real-world default frequencies, preventing under-provisioning. Furthermore, demographic variables (AGE, EDUCATION, SEX, MARRIAGE) contributed only 3.05% combined (with non-age protected classes under 1.25%), demonstrating fair lending compliance under ECOA rules.”</w:t>
+        <w:t>“We implemented a simplified Expected Credit Loss (ECL = EAD × PD × LGD) framework inspired by Basel III / IFRS 9 concepts, using standardized parameters (45% LGD and 20% CCF on undrawn lines). The Random Forest model achieved a Brier score of 0.1685 (a 12.0% improvement in probability error over the logistic benchmark), which provides more reliable inputs for expected loss estimation. For fair lending governance, an exploratory sensitivity check showed demographic features (Age, Education, Sex, Marriage) contributed only 3.05% of feature importance, with repayment discipline driving 97% of predictive power. In an actual production environment, protected characteristics would be formally excluded under ECOA Regulation B, and the scorecard would undergo adverse impact ratio (AIR) auditing before live deployment.”</w:t>
       </w:r>
     </w:p>
     <w:sectPr>

</xml_diff>

<commit_message>
refactor: audit remediations, risk score mathematical reconciliation, and test suite expansion
</commit_message>
<xml_diff>
--- a/reports/CreditLens_Comprehensive_Model_Report.docx
+++ b/reports/CreditLens_Comprehensive_Model_Report.docx
@@ -395,7 +395,7 @@
                 <w:color w:val="334155"/>
                 <w:sz w:val="20"/>
               </w:rPr>
-              <w:t>The Champion Random Forest model delivered an ROC-AUC of 0.7781 and a Kolmogorov-Smirnov (KS) statistic of 42.57%, generating a +8.4% relative lift in risk separation power over traditional linear scorecards. Translated into commercial bank economics on 6,000 unseen test borrowers, applying a FICO 620 cutoff intercepted NT$ 42.5M in severe default write-offs while maintaining loan approval volumes at 65.6%, creating a net commercial value of NT$ 36.0M (extrapolated holdout x5: +NT$ 180.2M).</w:t>
+              <w:t>The Champion Random Forest model delivered an ROC-AUC of 0.7781 and a Kolmogorov-Smirnov (KS) statistic of 42.57%, generating a +8.4% relative lift in risk separation power over traditional linear scorecards. Translated into commercial bank economics on 6,000 unseen test borrowers, applying a score cutoff of 620 intercepted NT$ 42.5M in severe default write-offs while maintaining loan approval volumes at 65.6%, creating a net commercial value of NT$ 36.0M (extrapolated holdout x5: +NT$ 180.2M).</w:t>
             </w:r>
           </w:p>
         </w:tc>
@@ -3959,7 +3959,7 @@
     </w:p>
     <w:p>
       <w:r>
-        <w:t>NOTE: This custom transformation is an internal illustrative risk score calibrated for demonstration and scenario simulation. It is NOT an official Fair Isaac Corporation (FICO) score or credit bureau rating.</w:t>
+        <w:t>NOTE: This custom transformation is an internal illustrative risk score scaled for demonstration and scenario simulation. It is NOT an official Fair Isaac Corporation (FICO) score or credit bureau rating.</w:t>
       </w:r>
     </w:p>
     <w:tbl>
@@ -6066,7 +6066,7 @@
                 <w:color w:val="334155"/>
                 <w:sz w:val="19"/>
               </w:rPr>
-              <w:t>FICO 500</w:t>
+              <w:t>Score 500</w:t>
             </w:r>
           </w:p>
         </w:tc>
@@ -6257,7 +6257,7 @@
                 <w:color w:val="334155"/>
                 <w:sz w:val="19"/>
               </w:rPr>
-              <w:t>FICO 550</w:t>
+              <w:t>Score 550</w:t>
             </w:r>
           </w:p>
         </w:tc>
@@ -6448,7 +6448,7 @@
                 <w:color w:val="334155"/>
                 <w:sz w:val="19"/>
               </w:rPr>
-              <w:t>FICO 600</w:t>
+              <w:t>Score 600</w:t>
             </w:r>
           </w:p>
         </w:tc>
@@ -6639,7 +6639,7 @@
                 <w:color w:val="334155"/>
                 <w:sz w:val="19"/>
               </w:rPr>
-              <w:t>FICO 620 (Optimal)</w:t>
+              <w:t>Score 620 (Optimal)</w:t>
             </w:r>
           </w:p>
         </w:tc>
@@ -6830,7 +6830,7 @@
                 <w:color w:val="334155"/>
                 <w:sz w:val="19"/>
               </w:rPr>
-              <w:t>FICO 660 (Near-Prime)</w:t>
+              <w:t>Score 660 (Near-Prime)</w:t>
             </w:r>
           </w:p>
         </w:tc>
@@ -7253,7 +7253,7 @@
                 <w:color w:val="334155"/>
                 <w:sz w:val="19"/>
               </w:rPr>
-              <w:t>FICO 500</w:t>
+              <w:t>Score 500</w:t>
             </w:r>
           </w:p>
         </w:tc>
@@ -7444,7 +7444,7 @@
                 <w:color w:val="334155"/>
                 <w:sz w:val="19"/>
               </w:rPr>
-              <w:t>FICO 550</w:t>
+              <w:t>Score 550</w:t>
             </w:r>
           </w:p>
         </w:tc>
@@ -7635,7 +7635,7 @@
                 <w:color w:val="334155"/>
                 <w:sz w:val="19"/>
               </w:rPr>
-              <w:t>FICO 600</w:t>
+              <w:t>Score 600</w:t>
             </w:r>
           </w:p>
         </w:tc>
@@ -7826,7 +7826,7 @@
                 <w:color w:val="334155"/>
                 <w:sz w:val="19"/>
               </w:rPr>
-              <w:t>FICO 620 (Optimal)</w:t>
+              <w:t>Score 620 (Optimal)</w:t>
             </w:r>
           </w:p>
         </w:tc>
@@ -8017,7 +8017,7 @@
                 <w:color w:val="334155"/>
                 <w:sz w:val="19"/>
               </w:rPr>
-              <w:t>FICO 660 (Near-Prime)</w:t>
+              <w:t>Score 660 (Near-Prime)</w:t>
             </w:r>
           </w:p>
         </w:tc>
@@ -8240,7 +8240,7 @@
               </w:rPr>
               <w:t>Optimal Policy Recommendation &amp; Methodology Integrity:</w:t>
               <w:br/>
-              <w:t>• On completely unseen accounts at FICO 620, the model achieves a 65.6% approval rate, cuts approved default rates nearly in half from 22.12% down to 11.35%, and intercepts NT$ 42.5M in bad debt on the 6k sample alone (extrapolated holdout x5: +NT$ 180.1M).</w:t>
+              <w:t>• On completely unseen accounts at score cutoff 620, the model achieves a 65.6% approval rate, cuts approved default rates nearly in half from 22.12% down to 11.35%, and intercepts NT$ 42.5M in bad debt on the 6k sample alone (extrapolated holdout x5: +NT$ 180.1M).</w:t>
               <w:br/>
               <w:t>• When simulated across the bank's whole 30,000-account population tape, the approved default rate drops to 7.73%, avoiding NT$ 232.9M in bad debt and delivering NT$ 206.6M in net commercial benefit.</w:t>
               <w:br/>

</xml_diff>